<commit_message>
Knowledge - 4/16/2026 - Part 3
</commit_message>
<xml_diff>
--- a/Knowledge/2-Science/3-Social science/1-Linguistics/0-Intro to Linguistics/5-My Source/1-Linguistics.docx
+++ b/Knowledge/2-Science/3-Social science/1-Linguistics/0-Intro to Linguistics/5-My Source/1-Linguistics.docx
@@ -39,60 +39,1554 @@
       </w:pPr>
       <w:r>
         <w:rPr>
-          <w:rFonts w:ascii="Arial" w:eastAsia="Arial" w:hAnsi="Arial"/>
-          <w:b/>
-          <w:color w:val="000000"/>
-          <w:sz w:val="18"/>
-          <w:highlight w:val="lightGray"/>
-        </w:rPr>
-        <w:t># Source: AI Source: Provided by: [Data Path</w:t>
-      </w:r>
-      <w:r>
-        <w:rPr>
-          <w:rFonts w:ascii="Arial" w:eastAsia="Arial" w:hAnsi="Arial"/>
-          <w:color w:val="000000"/>
-          <w:sz w:val="18"/>
-          <w:highlight w:val="lightGray"/>
-        </w:rPr>
-        <w:t xml:space="preserve">: Persons Table -&gt; ID Column: 1, Name_En Column: Motasem Essam] -&gt; </w:t>
-      </w:r>
-      <w:r>
-        <w:rPr>
-          <w:rFonts w:ascii="Arial" w:eastAsia="Arial" w:hAnsi="Arial"/>
-          <w:b/>
-          <w:color w:val="000000"/>
-          <w:sz w:val="18"/>
-          <w:highlight w:val="lightGray"/>
-        </w:rPr>
-        <w:t>From:</w:t>
-      </w:r>
-      <w:r>
-        <w:rPr>
-          <w:rFonts w:ascii="Arial" w:eastAsia="Arial" w:hAnsi="Arial"/>
-          <w:color w:val="000000"/>
-          <w:sz w:val="18"/>
-          <w:highlight w:val="lightGray"/>
-        </w:rPr>
-        <w:t xml:space="preserve"> [Chatgpt (GPT-4-turbo)] </w:t>
-      </w:r>
-      <w:r>
-        <w:rPr>
-          <w:rFonts w:ascii="Arial" w:eastAsia="Arial" w:hAnsi="Arial"/>
-          <w:b/>
-          <w:color w:val="000000"/>
-          <w:sz w:val="18"/>
-          <w:highlight w:val="lightGray"/>
-        </w:rPr>
-        <w:t xml:space="preserve">on </w:t>
-      </w:r>
-      <w:r>
-        <w:rPr>
-          <w:rFonts w:ascii="Arial" w:eastAsia="Arial" w:hAnsi="Arial"/>
-          <w:color w:val="000000"/>
-          <w:sz w:val="18"/>
-          <w:highlight w:val="lightGray"/>
-        </w:rPr>
-        <w:t>[7/21/2025]</w:t>
+          <w:rFonts w:ascii="Arial" w:hAnsi="Arial" w:eastAsia="Arial" w:cs="Arial"/>
+          <w:b/>
+          <w:i w:val="0"/>
+          <w:color w:val="000000"/>
+          <w:sz w:val="18"/>
+          <w:highlight w:val="lightGray"/>
+        </w:rPr>
+        <w:t>#</w:t>
+      </w:r>
+      <w:r>
+        <w:rPr>
+          <w:rFonts w:ascii="Arial" w:hAnsi="Arial" w:eastAsia="Arial" w:cs="Arial"/>
+          <w:b/>
+          <w:i w:val="0"/>
+          <w:color w:val="000000"/>
+          <w:sz w:val="18"/>
+          <w:highlight w:val="lightGray"/>
+        </w:rPr>
+        <w:t xml:space="preserve"> </w:t>
+      </w:r>
+      <w:r>
+        <w:rPr>
+          <w:rFonts w:ascii="Arial" w:hAnsi="Arial" w:eastAsia="Arial" w:cs="Arial"/>
+          <w:b/>
+          <w:i w:val="0"/>
+          <w:color w:val="000000"/>
+          <w:sz w:val="18"/>
+          <w:highlight w:val="lightGray"/>
+        </w:rPr>
+        <w:t>S</w:t>
+      </w:r>
+      <w:r>
+        <w:rPr>
+          <w:rFonts w:ascii="Arial" w:hAnsi="Arial" w:eastAsia="Arial" w:cs="Arial"/>
+          <w:b/>
+          <w:i w:val="0"/>
+          <w:color w:val="000000"/>
+          <w:sz w:val="18"/>
+          <w:highlight w:val="lightGray"/>
+        </w:rPr>
+        <w:t>o</w:t>
+      </w:r>
+      <w:r>
+        <w:rPr>
+          <w:rFonts w:ascii="Arial" w:hAnsi="Arial" w:eastAsia="Arial" w:cs="Arial"/>
+          <w:b/>
+          <w:i w:val="0"/>
+          <w:color w:val="000000"/>
+          <w:sz w:val="18"/>
+          <w:highlight w:val="lightGray"/>
+        </w:rPr>
+        <w:t>u</w:t>
+      </w:r>
+      <w:r>
+        <w:rPr>
+          <w:rFonts w:ascii="Arial" w:hAnsi="Arial" w:eastAsia="Arial" w:cs="Arial"/>
+          <w:b/>
+          <w:i w:val="0"/>
+          <w:color w:val="000000"/>
+          <w:sz w:val="18"/>
+          <w:highlight w:val="lightGray"/>
+        </w:rPr>
+        <w:t>r</w:t>
+      </w:r>
+      <w:r>
+        <w:rPr>
+          <w:rFonts w:ascii="Arial" w:hAnsi="Arial" w:eastAsia="Arial" w:cs="Arial"/>
+          <w:b/>
+          <w:i w:val="0"/>
+          <w:color w:val="000000"/>
+          <w:sz w:val="18"/>
+          <w:highlight w:val="lightGray"/>
+        </w:rPr>
+        <w:t>c</w:t>
+      </w:r>
+      <w:r>
+        <w:rPr>
+          <w:rFonts w:ascii="Arial" w:hAnsi="Arial" w:eastAsia="Arial" w:cs="Arial"/>
+          <w:b/>
+          <w:i w:val="0"/>
+          <w:color w:val="000000"/>
+          <w:sz w:val="18"/>
+          <w:highlight w:val="lightGray"/>
+        </w:rPr>
+        <w:t>e</w:t>
+      </w:r>
+      <w:r>
+        <w:rPr>
+          <w:rFonts w:ascii="Arial" w:hAnsi="Arial" w:eastAsia="Arial" w:cs="Arial"/>
+          <w:b/>
+          <w:i w:val="0"/>
+          <w:color w:val="000000"/>
+          <w:sz w:val="18"/>
+          <w:highlight w:val="lightGray"/>
+        </w:rPr>
+        <w:t>:</w:t>
+      </w:r>
+      <w:r>
+        <w:rPr>
+          <w:rFonts w:ascii="Arial" w:hAnsi="Arial" w:eastAsia="Arial" w:cs="Arial"/>
+          <w:b/>
+          <w:i w:val="0"/>
+          <w:color w:val="000000"/>
+          <w:sz w:val="18"/>
+          <w:highlight w:val="lightGray"/>
+        </w:rPr>
+        <w:t xml:space="preserve"> </w:t>
+      </w:r>
+      <w:r>
+        <w:rPr>
+          <w:rFonts w:ascii="Arial" w:hAnsi="Arial" w:eastAsia="Arial" w:cs="Arial"/>
+          <w:b/>
+          <w:i w:val="0"/>
+          <w:color w:val="000000"/>
+          <w:sz w:val="18"/>
+          <w:highlight w:val="lightGray"/>
+        </w:rPr>
+        <w:t>A</w:t>
+      </w:r>
+      <w:r>
+        <w:rPr>
+          <w:rFonts w:ascii="Arial" w:hAnsi="Arial" w:eastAsia="Arial" w:cs="Arial"/>
+          <w:b/>
+          <w:i w:val="0"/>
+          <w:color w:val="000000"/>
+          <w:sz w:val="18"/>
+          <w:highlight w:val="lightGray"/>
+        </w:rPr>
+        <w:t>I</w:t>
+      </w:r>
+      <w:r>
+        <w:rPr>
+          <w:rFonts w:ascii="Arial" w:hAnsi="Arial" w:eastAsia="Arial" w:cs="Arial"/>
+          <w:b/>
+          <w:i w:val="0"/>
+          <w:color w:val="000000"/>
+          <w:sz w:val="18"/>
+          <w:highlight w:val="lightGray"/>
+        </w:rPr>
+        <w:t xml:space="preserve"> </w:t>
+      </w:r>
+      <w:r>
+        <w:rPr>
+          <w:rFonts w:ascii="Arial" w:hAnsi="Arial" w:eastAsia="Arial" w:cs="Arial"/>
+          <w:b/>
+          <w:i w:val="0"/>
+          <w:color w:val="000000"/>
+          <w:sz w:val="18"/>
+          <w:highlight w:val="lightGray"/>
+        </w:rPr>
+        <w:t>S</w:t>
+      </w:r>
+      <w:r>
+        <w:rPr>
+          <w:rFonts w:ascii="Arial" w:hAnsi="Arial" w:eastAsia="Arial" w:cs="Arial"/>
+          <w:b/>
+          <w:i w:val="0"/>
+          <w:color w:val="000000"/>
+          <w:sz w:val="18"/>
+          <w:highlight w:val="lightGray"/>
+        </w:rPr>
+        <w:t>o</w:t>
+      </w:r>
+      <w:r>
+        <w:rPr>
+          <w:rFonts w:ascii="Arial" w:hAnsi="Arial" w:eastAsia="Arial" w:cs="Arial"/>
+          <w:b/>
+          <w:i w:val="0"/>
+          <w:color w:val="000000"/>
+          <w:sz w:val="18"/>
+          <w:highlight w:val="lightGray"/>
+        </w:rPr>
+        <w:t>u</w:t>
+      </w:r>
+      <w:r>
+        <w:rPr>
+          <w:rFonts w:ascii="Arial" w:hAnsi="Arial" w:eastAsia="Arial" w:cs="Arial"/>
+          <w:b/>
+          <w:i w:val="0"/>
+          <w:color w:val="000000"/>
+          <w:sz w:val="18"/>
+          <w:highlight w:val="lightGray"/>
+        </w:rPr>
+        <w:t>r</w:t>
+      </w:r>
+      <w:r>
+        <w:rPr>
+          <w:rFonts w:ascii="Arial" w:hAnsi="Arial" w:eastAsia="Arial" w:cs="Arial"/>
+          <w:b/>
+          <w:i w:val="0"/>
+          <w:color w:val="000000"/>
+          <w:sz w:val="18"/>
+          <w:highlight w:val="lightGray"/>
+        </w:rPr>
+        <w:t>c</w:t>
+      </w:r>
+      <w:r>
+        <w:rPr>
+          <w:rFonts w:ascii="Arial" w:hAnsi="Arial" w:eastAsia="Arial" w:cs="Arial"/>
+          <w:b/>
+          <w:i w:val="0"/>
+          <w:color w:val="000000"/>
+          <w:sz w:val="18"/>
+          <w:highlight w:val="lightGray"/>
+        </w:rPr>
+        <w:t>e</w:t>
+      </w:r>
+      <w:r>
+        <w:rPr>
+          <w:rFonts w:ascii="Arial" w:hAnsi="Arial" w:eastAsia="Arial" w:cs="Arial"/>
+          <w:b/>
+          <w:i w:val="0"/>
+          <w:color w:val="000000"/>
+          <w:sz w:val="18"/>
+          <w:highlight w:val="lightGray"/>
+        </w:rPr>
+        <w:t>:</w:t>
+      </w:r>
+      <w:r>
+        <w:rPr>
+          <w:rFonts w:ascii="Arial" w:hAnsi="Arial" w:eastAsia="Arial" w:cs="Arial"/>
+          <w:b/>
+          <w:i w:val="0"/>
+          <w:color w:val="000000"/>
+          <w:sz w:val="18"/>
+          <w:highlight w:val="lightGray"/>
+        </w:rPr>
+        <w:t xml:space="preserve"> </w:t>
+      </w:r>
+      <w:r>
+        <w:rPr>
+          <w:rFonts w:ascii="Arial" w:hAnsi="Arial" w:eastAsia="Arial" w:cs="Arial"/>
+          <w:b/>
+          <w:i w:val="0"/>
+          <w:color w:val="000000"/>
+          <w:sz w:val="18"/>
+          <w:highlight w:val="lightGray"/>
+        </w:rPr>
+        <w:t>P</w:t>
+      </w:r>
+      <w:r>
+        <w:rPr>
+          <w:rFonts w:ascii="Arial" w:hAnsi="Arial" w:eastAsia="Arial" w:cs="Arial"/>
+          <w:b/>
+          <w:i w:val="0"/>
+          <w:color w:val="000000"/>
+          <w:sz w:val="18"/>
+          <w:highlight w:val="lightGray"/>
+        </w:rPr>
+        <w:t>r</w:t>
+      </w:r>
+      <w:r>
+        <w:rPr>
+          <w:rFonts w:ascii="Arial" w:hAnsi="Arial" w:eastAsia="Arial" w:cs="Arial"/>
+          <w:b/>
+          <w:i w:val="0"/>
+          <w:color w:val="000000"/>
+          <w:sz w:val="18"/>
+          <w:highlight w:val="lightGray"/>
+        </w:rPr>
+        <w:t>o</w:t>
+      </w:r>
+      <w:r>
+        <w:rPr>
+          <w:rFonts w:ascii="Arial" w:hAnsi="Arial" w:eastAsia="Arial" w:cs="Arial"/>
+          <w:b/>
+          <w:i w:val="0"/>
+          <w:color w:val="000000"/>
+          <w:sz w:val="18"/>
+          <w:highlight w:val="lightGray"/>
+        </w:rPr>
+        <w:t>v</w:t>
+      </w:r>
+      <w:r>
+        <w:rPr>
+          <w:rFonts w:ascii="Arial" w:hAnsi="Arial" w:eastAsia="Arial" w:cs="Arial"/>
+          <w:b/>
+          <w:i w:val="0"/>
+          <w:color w:val="000000"/>
+          <w:sz w:val="18"/>
+          <w:highlight w:val="lightGray"/>
+        </w:rPr>
+        <w:t>i</w:t>
+      </w:r>
+      <w:r>
+        <w:rPr>
+          <w:rFonts w:ascii="Arial" w:hAnsi="Arial" w:eastAsia="Arial" w:cs="Arial"/>
+          <w:b/>
+          <w:i w:val="0"/>
+          <w:color w:val="000000"/>
+          <w:sz w:val="18"/>
+          <w:highlight w:val="lightGray"/>
+        </w:rPr>
+        <w:t>d</w:t>
+      </w:r>
+      <w:r>
+        <w:rPr>
+          <w:rFonts w:ascii="Arial" w:hAnsi="Arial" w:eastAsia="Arial" w:cs="Arial"/>
+          <w:b/>
+          <w:i w:val="0"/>
+          <w:color w:val="000000"/>
+          <w:sz w:val="18"/>
+          <w:highlight w:val="lightGray"/>
+        </w:rPr>
+        <w:t>e</w:t>
+      </w:r>
+      <w:r>
+        <w:rPr>
+          <w:rFonts w:ascii="Arial" w:hAnsi="Arial" w:eastAsia="Arial" w:cs="Arial"/>
+          <w:b/>
+          <w:i w:val="0"/>
+          <w:color w:val="000000"/>
+          <w:sz w:val="18"/>
+          <w:highlight w:val="lightGray"/>
+        </w:rPr>
+        <w:t>d</w:t>
+      </w:r>
+      <w:r>
+        <w:rPr>
+          <w:rFonts w:ascii="Arial" w:hAnsi="Arial" w:eastAsia="Arial" w:cs="Arial"/>
+          <w:b/>
+          <w:i w:val="0"/>
+          <w:color w:val="000000"/>
+          <w:sz w:val="18"/>
+          <w:highlight w:val="lightGray"/>
+        </w:rPr>
+        <w:t xml:space="preserve"> </w:t>
+      </w:r>
+      <w:r>
+        <w:rPr>
+          <w:rFonts w:ascii="Arial" w:hAnsi="Arial" w:eastAsia="Arial" w:cs="Arial"/>
+          <w:b/>
+          <w:i w:val="0"/>
+          <w:color w:val="000000"/>
+          <w:sz w:val="18"/>
+          <w:highlight w:val="lightGray"/>
+        </w:rPr>
+        <w:t>b</w:t>
+      </w:r>
+      <w:r>
+        <w:rPr>
+          <w:rFonts w:ascii="Arial" w:hAnsi="Arial" w:eastAsia="Arial" w:cs="Arial"/>
+          <w:b/>
+          <w:i w:val="0"/>
+          <w:color w:val="000000"/>
+          <w:sz w:val="18"/>
+          <w:highlight w:val="lightGray"/>
+        </w:rPr>
+        <w:t>y</w:t>
+      </w:r>
+      <w:r>
+        <w:rPr>
+          <w:rFonts w:ascii="Arial" w:hAnsi="Arial" w:eastAsia="Arial" w:cs="Arial"/>
+          <w:b/>
+          <w:i w:val="0"/>
+          <w:color w:val="000000"/>
+          <w:sz w:val="18"/>
+          <w:highlight w:val="lightGray"/>
+        </w:rPr>
+        <w:t>:</w:t>
+      </w:r>
+      <w:r>
+        <w:rPr>
+          <w:rFonts w:ascii="Arial" w:hAnsi="Arial" w:eastAsia="Arial" w:cs="Arial"/>
+          <w:b/>
+          <w:i w:val="0"/>
+          <w:color w:val="000000"/>
+          <w:sz w:val="18"/>
+          <w:highlight w:val="lightGray"/>
+        </w:rPr>
+        <w:t xml:space="preserve"> </w:t>
+      </w:r>
+      <w:r>
+        <w:rPr>
+          <w:rFonts w:ascii="Arial" w:hAnsi="Arial" w:eastAsia="Arial" w:cs="Arial"/>
+          <w:b/>
+          <w:i w:val="0"/>
+          <w:color w:val="000000"/>
+          <w:sz w:val="18"/>
+          <w:highlight w:val="lightGray"/>
+        </w:rPr>
+        <w:t>[</w:t>
+      </w:r>
+      <w:r>
+        <w:rPr>
+          <w:rFonts w:ascii="Arial" w:hAnsi="Arial" w:eastAsia="Arial" w:cs="Arial"/>
+          <w:b/>
+          <w:i w:val="0"/>
+          <w:color w:val="000000"/>
+          <w:sz w:val="18"/>
+          <w:highlight w:val="lightGray"/>
+        </w:rPr>
+        <w:t>D</w:t>
+      </w:r>
+      <w:r>
+        <w:rPr>
+          <w:rFonts w:ascii="Arial" w:hAnsi="Arial" w:eastAsia="Arial" w:cs="Arial"/>
+          <w:b/>
+          <w:i w:val="0"/>
+          <w:color w:val="000000"/>
+          <w:sz w:val="18"/>
+          <w:highlight w:val="lightGray"/>
+        </w:rPr>
+        <w:t>a</w:t>
+      </w:r>
+      <w:r>
+        <w:rPr>
+          <w:rFonts w:ascii="Arial" w:hAnsi="Arial" w:eastAsia="Arial" w:cs="Arial"/>
+          <w:b/>
+          <w:i w:val="0"/>
+          <w:color w:val="000000"/>
+          <w:sz w:val="18"/>
+          <w:highlight w:val="lightGray"/>
+        </w:rPr>
+        <w:t>t</w:t>
+      </w:r>
+      <w:r>
+        <w:rPr>
+          <w:rFonts w:ascii="Arial" w:hAnsi="Arial" w:eastAsia="Arial" w:cs="Arial"/>
+          <w:b/>
+          <w:i w:val="0"/>
+          <w:color w:val="000000"/>
+          <w:sz w:val="18"/>
+          <w:highlight w:val="lightGray"/>
+        </w:rPr>
+        <w:t>a</w:t>
+      </w:r>
+      <w:r>
+        <w:rPr>
+          <w:rFonts w:ascii="Arial" w:hAnsi="Arial" w:eastAsia="Arial" w:cs="Arial"/>
+          <w:b/>
+          <w:i w:val="0"/>
+          <w:color w:val="000000"/>
+          <w:sz w:val="18"/>
+          <w:highlight w:val="lightGray"/>
+        </w:rPr>
+        <w:t xml:space="preserve"> </w:t>
+      </w:r>
+      <w:r>
+        <w:rPr>
+          <w:rFonts w:ascii="Arial" w:hAnsi="Arial" w:eastAsia="Arial" w:cs="Arial"/>
+          <w:b/>
+          <w:i w:val="0"/>
+          <w:color w:val="000000"/>
+          <w:sz w:val="18"/>
+          <w:highlight w:val="lightGray"/>
+        </w:rPr>
+        <w:t>P</w:t>
+      </w:r>
+      <w:r>
+        <w:rPr>
+          <w:rFonts w:ascii="Arial" w:hAnsi="Arial" w:eastAsia="Arial" w:cs="Arial"/>
+          <w:b/>
+          <w:i w:val="0"/>
+          <w:color w:val="000000"/>
+          <w:sz w:val="18"/>
+          <w:highlight w:val="lightGray"/>
+        </w:rPr>
+        <w:t>a</w:t>
+      </w:r>
+      <w:r>
+        <w:rPr>
+          <w:rFonts w:ascii="Arial" w:hAnsi="Arial" w:eastAsia="Arial" w:cs="Arial"/>
+          <w:b/>
+          <w:i w:val="0"/>
+          <w:color w:val="000000"/>
+          <w:sz w:val="18"/>
+          <w:highlight w:val="lightGray"/>
+        </w:rPr>
+        <w:t>t</w:t>
+      </w:r>
+      <w:r>
+        <w:rPr>
+          <w:rFonts w:ascii="Arial" w:hAnsi="Arial" w:eastAsia="Arial" w:cs="Arial"/>
+          <w:b/>
+          <w:i w:val="0"/>
+          <w:color w:val="000000"/>
+          <w:sz w:val="18"/>
+          <w:highlight w:val="lightGray"/>
+        </w:rPr>
+        <w:t>h</w:t>
+      </w:r>
+      <w:r>
+        <w:rPr>
+          <w:rFonts w:ascii="Arial" w:hAnsi="Arial" w:eastAsia="Arial" w:cs="Arial"/>
+          <w:b w:val="0"/>
+          <w:i w:val="0"/>
+          <w:color w:val="000000"/>
+          <w:sz w:val="18"/>
+          <w:highlight w:val="lightGray"/>
+        </w:rPr>
+        <w:t>:</w:t>
+      </w:r>
+      <w:r>
+        <w:rPr>
+          <w:rFonts w:ascii="Arial" w:hAnsi="Arial" w:eastAsia="Arial" w:cs="Arial"/>
+          <w:b w:val="0"/>
+          <w:i w:val="0"/>
+          <w:color w:val="000000"/>
+          <w:sz w:val="18"/>
+          <w:highlight w:val="lightGray"/>
+        </w:rPr>
+        <w:t xml:space="preserve"> </w:t>
+      </w:r>
+      <w:r>
+        <w:rPr>
+          <w:rFonts w:ascii="Arial" w:hAnsi="Arial" w:eastAsia="Arial" w:cs="Arial"/>
+          <w:b w:val="0"/>
+          <w:i w:val="0"/>
+          <w:color w:val="000000"/>
+          <w:sz w:val="18"/>
+          <w:highlight w:val="lightGray"/>
+        </w:rPr>
+        <w:t>P</w:t>
+      </w:r>
+      <w:r>
+        <w:rPr>
+          <w:rFonts w:ascii="Arial" w:hAnsi="Arial" w:eastAsia="Arial" w:cs="Arial"/>
+          <w:b w:val="0"/>
+          <w:i w:val="0"/>
+          <w:color w:val="000000"/>
+          <w:sz w:val="18"/>
+          <w:highlight w:val="lightGray"/>
+        </w:rPr>
+        <w:t>e</w:t>
+      </w:r>
+      <w:r>
+        <w:rPr>
+          <w:rFonts w:ascii="Arial" w:hAnsi="Arial" w:eastAsia="Arial" w:cs="Arial"/>
+          <w:b w:val="0"/>
+          <w:i w:val="0"/>
+          <w:color w:val="000000"/>
+          <w:sz w:val="18"/>
+          <w:highlight w:val="lightGray"/>
+        </w:rPr>
+        <w:t>r</w:t>
+      </w:r>
+      <w:r>
+        <w:rPr>
+          <w:rFonts w:ascii="Arial" w:hAnsi="Arial" w:eastAsia="Arial" w:cs="Arial"/>
+          <w:b w:val="0"/>
+          <w:i w:val="0"/>
+          <w:color w:val="000000"/>
+          <w:sz w:val="18"/>
+          <w:highlight w:val="lightGray"/>
+        </w:rPr>
+        <w:t>s</w:t>
+      </w:r>
+      <w:r>
+        <w:rPr>
+          <w:rFonts w:ascii="Arial" w:hAnsi="Arial" w:eastAsia="Arial" w:cs="Arial"/>
+          <w:b w:val="0"/>
+          <w:i w:val="0"/>
+          <w:color w:val="000000"/>
+          <w:sz w:val="18"/>
+          <w:highlight w:val="lightGray"/>
+        </w:rPr>
+        <w:t>o</w:t>
+      </w:r>
+      <w:r>
+        <w:rPr>
+          <w:rFonts w:ascii="Arial" w:hAnsi="Arial" w:eastAsia="Arial" w:cs="Arial"/>
+          <w:b w:val="0"/>
+          <w:i w:val="0"/>
+          <w:color w:val="000000"/>
+          <w:sz w:val="18"/>
+          <w:highlight w:val="lightGray"/>
+        </w:rPr>
+        <w:t>n</w:t>
+      </w:r>
+      <w:r>
+        <w:rPr>
+          <w:rFonts w:ascii="Arial" w:hAnsi="Arial" w:eastAsia="Arial" w:cs="Arial"/>
+          <w:b w:val="0"/>
+          <w:i w:val="0"/>
+          <w:color w:val="000000"/>
+          <w:sz w:val="18"/>
+          <w:highlight w:val="lightGray"/>
+        </w:rPr>
+        <w:t>s</w:t>
+      </w:r>
+      <w:r>
+        <w:rPr>
+          <w:rFonts w:ascii="Arial" w:hAnsi="Arial" w:eastAsia="Arial" w:cs="Arial"/>
+          <w:b w:val="0"/>
+          <w:i w:val="0"/>
+          <w:color w:val="000000"/>
+          <w:sz w:val="18"/>
+          <w:highlight w:val="lightGray"/>
+        </w:rPr>
+        <w:t xml:space="preserve"> </w:t>
+      </w:r>
+      <w:r>
+        <w:rPr>
+          <w:rFonts w:ascii="Arial" w:hAnsi="Arial" w:eastAsia="Arial" w:cs="Arial"/>
+          <w:b w:val="0"/>
+          <w:i w:val="0"/>
+          <w:color w:val="000000"/>
+          <w:sz w:val="18"/>
+          <w:highlight w:val="lightGray"/>
+        </w:rPr>
+        <w:t>T</w:t>
+      </w:r>
+      <w:r>
+        <w:rPr>
+          <w:rFonts w:ascii="Arial" w:hAnsi="Arial" w:eastAsia="Arial" w:cs="Arial"/>
+          <w:b w:val="0"/>
+          <w:i w:val="0"/>
+          <w:color w:val="000000"/>
+          <w:sz w:val="18"/>
+          <w:highlight w:val="lightGray"/>
+        </w:rPr>
+        <w:t>a</w:t>
+      </w:r>
+      <w:r>
+        <w:rPr>
+          <w:rFonts w:ascii="Arial" w:hAnsi="Arial" w:eastAsia="Arial" w:cs="Arial"/>
+          <w:b w:val="0"/>
+          <w:i w:val="0"/>
+          <w:color w:val="000000"/>
+          <w:sz w:val="18"/>
+          <w:highlight w:val="lightGray"/>
+        </w:rPr>
+        <w:t>b</w:t>
+      </w:r>
+      <w:r>
+        <w:rPr>
+          <w:rFonts w:ascii="Arial" w:hAnsi="Arial" w:eastAsia="Arial" w:cs="Arial"/>
+          <w:b w:val="0"/>
+          <w:i w:val="0"/>
+          <w:color w:val="000000"/>
+          <w:sz w:val="18"/>
+          <w:highlight w:val="lightGray"/>
+        </w:rPr>
+        <w:t>l</w:t>
+      </w:r>
+      <w:r>
+        <w:rPr>
+          <w:rFonts w:ascii="Arial" w:hAnsi="Arial" w:eastAsia="Arial" w:cs="Arial"/>
+          <w:b w:val="0"/>
+          <w:i w:val="0"/>
+          <w:color w:val="000000"/>
+          <w:sz w:val="18"/>
+          <w:highlight w:val="lightGray"/>
+        </w:rPr>
+        <w:t>e</w:t>
+      </w:r>
+      <w:r>
+        <w:rPr>
+          <w:rFonts w:ascii="Arial" w:hAnsi="Arial" w:eastAsia="Arial" w:cs="Arial"/>
+          <w:b w:val="0"/>
+          <w:i w:val="0"/>
+          <w:color w:val="000000"/>
+          <w:sz w:val="18"/>
+          <w:highlight w:val="lightGray"/>
+        </w:rPr>
+        <w:t xml:space="preserve"> </w:t>
+      </w:r>
+      <w:r>
+        <w:rPr>
+          <w:rFonts w:ascii="Arial" w:hAnsi="Arial" w:eastAsia="Arial" w:cs="Arial"/>
+          <w:b w:val="0"/>
+          <w:i w:val="0"/>
+          <w:color w:val="000000"/>
+          <w:sz w:val="18"/>
+          <w:highlight w:val="lightGray"/>
+        </w:rPr>
+        <w:t>-</w:t>
+      </w:r>
+      <w:r>
+        <w:rPr>
+          <w:rFonts w:ascii="Arial" w:hAnsi="Arial" w:eastAsia="Arial" w:cs="Arial"/>
+          <w:b w:val="0"/>
+          <w:i w:val="0"/>
+          <w:color w:val="000000"/>
+          <w:sz w:val="18"/>
+          <w:highlight w:val="lightGray"/>
+        </w:rPr>
+        <w:t>&gt;</w:t>
+      </w:r>
+      <w:r>
+        <w:rPr>
+          <w:rFonts w:ascii="Arial" w:hAnsi="Arial" w:eastAsia="Arial" w:cs="Arial"/>
+          <w:b w:val="0"/>
+          <w:i w:val="0"/>
+          <w:color w:val="000000"/>
+          <w:sz w:val="18"/>
+          <w:highlight w:val="lightGray"/>
+        </w:rPr>
+        <w:t xml:space="preserve"> </w:t>
+      </w:r>
+      <w:r>
+        <w:rPr>
+          <w:rFonts w:ascii="Arial" w:hAnsi="Arial" w:eastAsia="Arial" w:cs="Arial"/>
+          <w:b w:val="0"/>
+          <w:i w:val="0"/>
+          <w:color w:val="000000"/>
+          <w:sz w:val="18"/>
+          <w:highlight w:val="lightGray"/>
+        </w:rPr>
+        <w:t>I</w:t>
+      </w:r>
+      <w:r>
+        <w:rPr>
+          <w:rFonts w:ascii="Arial" w:hAnsi="Arial" w:eastAsia="Arial" w:cs="Arial"/>
+          <w:b w:val="0"/>
+          <w:i w:val="0"/>
+          <w:color w:val="000000"/>
+          <w:sz w:val="18"/>
+          <w:highlight w:val="lightGray"/>
+        </w:rPr>
+        <w:t>D</w:t>
+      </w:r>
+      <w:r>
+        <w:rPr>
+          <w:rFonts w:ascii="Arial" w:hAnsi="Arial" w:eastAsia="Arial" w:cs="Arial"/>
+          <w:b w:val="0"/>
+          <w:i w:val="0"/>
+          <w:color w:val="000000"/>
+          <w:sz w:val="18"/>
+          <w:highlight w:val="lightGray"/>
+        </w:rPr>
+        <w:t xml:space="preserve"> </w:t>
+      </w:r>
+      <w:r>
+        <w:rPr>
+          <w:rFonts w:ascii="Arial" w:hAnsi="Arial" w:eastAsia="Arial" w:cs="Arial"/>
+          <w:b w:val="0"/>
+          <w:i w:val="0"/>
+          <w:color w:val="000000"/>
+          <w:sz w:val="18"/>
+          <w:highlight w:val="lightGray"/>
+        </w:rPr>
+        <w:t>C</w:t>
+      </w:r>
+      <w:r>
+        <w:rPr>
+          <w:rFonts w:ascii="Arial" w:hAnsi="Arial" w:eastAsia="Arial" w:cs="Arial"/>
+          <w:b w:val="0"/>
+          <w:i w:val="0"/>
+          <w:color w:val="000000"/>
+          <w:sz w:val="18"/>
+          <w:highlight w:val="lightGray"/>
+        </w:rPr>
+        <w:t>o</w:t>
+      </w:r>
+      <w:r>
+        <w:rPr>
+          <w:rFonts w:ascii="Arial" w:hAnsi="Arial" w:eastAsia="Arial" w:cs="Arial"/>
+          <w:b w:val="0"/>
+          <w:i w:val="0"/>
+          <w:color w:val="000000"/>
+          <w:sz w:val="18"/>
+          <w:highlight w:val="lightGray"/>
+        </w:rPr>
+        <w:t>l</w:t>
+      </w:r>
+      <w:r>
+        <w:rPr>
+          <w:rFonts w:ascii="Arial" w:hAnsi="Arial" w:eastAsia="Arial" w:cs="Arial"/>
+          <w:b w:val="0"/>
+          <w:i w:val="0"/>
+          <w:color w:val="000000"/>
+          <w:sz w:val="18"/>
+          <w:highlight w:val="lightGray"/>
+        </w:rPr>
+        <w:t>u</w:t>
+      </w:r>
+      <w:r>
+        <w:rPr>
+          <w:rFonts w:ascii="Arial" w:hAnsi="Arial" w:eastAsia="Arial" w:cs="Arial"/>
+          <w:b w:val="0"/>
+          <w:i w:val="0"/>
+          <w:color w:val="000000"/>
+          <w:sz w:val="18"/>
+          <w:highlight w:val="lightGray"/>
+        </w:rPr>
+        <w:t>m</w:t>
+      </w:r>
+      <w:r>
+        <w:rPr>
+          <w:rFonts w:ascii="Arial" w:hAnsi="Arial" w:eastAsia="Arial" w:cs="Arial"/>
+          <w:b w:val="0"/>
+          <w:i w:val="0"/>
+          <w:color w:val="000000"/>
+          <w:sz w:val="18"/>
+          <w:highlight w:val="lightGray"/>
+        </w:rPr>
+        <w:t>n</w:t>
+      </w:r>
+      <w:r>
+        <w:rPr>
+          <w:rFonts w:ascii="Arial" w:hAnsi="Arial" w:eastAsia="Arial" w:cs="Arial"/>
+          <w:b w:val="0"/>
+          <w:i w:val="0"/>
+          <w:color w:val="000000"/>
+          <w:sz w:val="18"/>
+          <w:highlight w:val="lightGray"/>
+        </w:rPr>
+        <w:t>:</w:t>
+      </w:r>
+      <w:r>
+        <w:rPr>
+          <w:rFonts w:ascii="Arial" w:hAnsi="Arial" w:eastAsia="Arial" w:cs="Arial"/>
+          <w:b w:val="0"/>
+          <w:i w:val="0"/>
+          <w:color w:val="000000"/>
+          <w:sz w:val="18"/>
+          <w:highlight w:val="lightGray"/>
+        </w:rPr>
+        <w:t xml:space="preserve"> </w:t>
+      </w:r>
+      <w:r>
+        <w:rPr>
+          <w:rFonts w:ascii="Arial" w:hAnsi="Arial" w:eastAsia="Arial" w:cs="Arial"/>
+          <w:b w:val="0"/>
+          <w:i w:val="0"/>
+          <w:color w:val="000000"/>
+          <w:sz w:val="18"/>
+          <w:highlight w:val="lightGray"/>
+        </w:rPr>
+        <w:t>1</w:t>
+      </w:r>
+      <w:r>
+        <w:rPr>
+          <w:rFonts w:ascii="Arial" w:hAnsi="Arial" w:eastAsia="Arial" w:cs="Arial"/>
+          <w:b w:val="0"/>
+          <w:i w:val="0"/>
+          <w:color w:val="000000"/>
+          <w:sz w:val="18"/>
+          <w:highlight w:val="lightGray"/>
+        </w:rPr>
+        <w:t>,</w:t>
+      </w:r>
+      <w:r>
+        <w:rPr>
+          <w:rFonts w:ascii="Arial" w:hAnsi="Arial" w:eastAsia="Arial" w:cs="Arial"/>
+          <w:b w:val="0"/>
+          <w:i w:val="0"/>
+          <w:color w:val="000000"/>
+          <w:sz w:val="18"/>
+          <w:highlight w:val="lightGray"/>
+        </w:rPr>
+        <w:t xml:space="preserve"> </w:t>
+      </w:r>
+      <w:r>
+        <w:rPr>
+          <w:rFonts w:ascii="Arial" w:hAnsi="Arial" w:eastAsia="Arial" w:cs="Arial"/>
+          <w:b w:val="0"/>
+          <w:i w:val="0"/>
+          <w:color w:val="000000"/>
+          <w:sz w:val="18"/>
+          <w:highlight w:val="lightGray"/>
+        </w:rPr>
+        <w:t>N</w:t>
+      </w:r>
+      <w:r>
+        <w:rPr>
+          <w:rFonts w:ascii="Arial" w:hAnsi="Arial" w:eastAsia="Arial" w:cs="Arial"/>
+          <w:b w:val="0"/>
+          <w:i w:val="0"/>
+          <w:color w:val="000000"/>
+          <w:sz w:val="18"/>
+          <w:highlight w:val="lightGray"/>
+        </w:rPr>
+        <w:t>a</w:t>
+      </w:r>
+      <w:r>
+        <w:rPr>
+          <w:rFonts w:ascii="Arial" w:hAnsi="Arial" w:eastAsia="Arial" w:cs="Arial"/>
+          <w:b w:val="0"/>
+          <w:i w:val="0"/>
+          <w:color w:val="000000"/>
+          <w:sz w:val="18"/>
+          <w:highlight w:val="lightGray"/>
+        </w:rPr>
+        <w:t>m</w:t>
+      </w:r>
+      <w:r>
+        <w:rPr>
+          <w:rFonts w:ascii="Arial" w:hAnsi="Arial" w:eastAsia="Arial" w:cs="Arial"/>
+          <w:b w:val="0"/>
+          <w:i w:val="0"/>
+          <w:color w:val="000000"/>
+          <w:sz w:val="18"/>
+          <w:highlight w:val="lightGray"/>
+        </w:rPr>
+        <w:t>e</w:t>
+      </w:r>
+      <w:r>
+        <w:rPr>
+          <w:rFonts w:ascii="Arial" w:hAnsi="Arial" w:eastAsia="Arial" w:cs="Arial"/>
+          <w:b w:val="0"/>
+          <w:i w:val="0"/>
+          <w:color w:val="000000"/>
+          <w:sz w:val="18"/>
+          <w:highlight w:val="lightGray"/>
+        </w:rPr>
+        <w:t>_</w:t>
+      </w:r>
+      <w:r>
+        <w:rPr>
+          <w:rFonts w:ascii="Arial" w:hAnsi="Arial" w:eastAsia="Arial" w:cs="Arial"/>
+          <w:b w:val="0"/>
+          <w:i w:val="0"/>
+          <w:color w:val="000000"/>
+          <w:sz w:val="18"/>
+          <w:highlight w:val="lightGray"/>
+        </w:rPr>
+        <w:t>E</w:t>
+      </w:r>
+      <w:r>
+        <w:rPr>
+          <w:rFonts w:ascii="Arial" w:hAnsi="Arial" w:eastAsia="Arial" w:cs="Arial"/>
+          <w:b w:val="0"/>
+          <w:i w:val="0"/>
+          <w:color w:val="000000"/>
+          <w:sz w:val="18"/>
+          <w:highlight w:val="lightGray"/>
+        </w:rPr>
+        <w:t>n</w:t>
+      </w:r>
+      <w:r>
+        <w:rPr>
+          <w:rFonts w:ascii="Arial" w:hAnsi="Arial" w:eastAsia="Arial" w:cs="Arial"/>
+          <w:b w:val="0"/>
+          <w:i w:val="0"/>
+          <w:color w:val="000000"/>
+          <w:sz w:val="18"/>
+          <w:highlight w:val="lightGray"/>
+        </w:rPr>
+        <w:t xml:space="preserve"> </w:t>
+      </w:r>
+      <w:r>
+        <w:rPr>
+          <w:rFonts w:ascii="Arial" w:hAnsi="Arial" w:eastAsia="Arial" w:cs="Arial"/>
+          <w:b w:val="0"/>
+          <w:i w:val="0"/>
+          <w:color w:val="000000"/>
+          <w:sz w:val="18"/>
+          <w:highlight w:val="lightGray"/>
+        </w:rPr>
+        <w:t>C</w:t>
+      </w:r>
+      <w:r>
+        <w:rPr>
+          <w:rFonts w:ascii="Arial" w:hAnsi="Arial" w:eastAsia="Arial" w:cs="Arial"/>
+          <w:b w:val="0"/>
+          <w:i w:val="0"/>
+          <w:color w:val="000000"/>
+          <w:sz w:val="18"/>
+          <w:highlight w:val="lightGray"/>
+        </w:rPr>
+        <w:t>o</w:t>
+      </w:r>
+      <w:r>
+        <w:rPr>
+          <w:rFonts w:ascii="Arial" w:hAnsi="Arial" w:eastAsia="Arial" w:cs="Arial"/>
+          <w:b w:val="0"/>
+          <w:i w:val="0"/>
+          <w:color w:val="000000"/>
+          <w:sz w:val="18"/>
+          <w:highlight w:val="lightGray"/>
+        </w:rPr>
+        <w:t>l</w:t>
+      </w:r>
+      <w:r>
+        <w:rPr>
+          <w:rFonts w:ascii="Arial" w:hAnsi="Arial" w:eastAsia="Arial" w:cs="Arial"/>
+          <w:b w:val="0"/>
+          <w:i w:val="0"/>
+          <w:color w:val="000000"/>
+          <w:sz w:val="18"/>
+          <w:highlight w:val="lightGray"/>
+        </w:rPr>
+        <w:t>u</w:t>
+      </w:r>
+      <w:r>
+        <w:rPr>
+          <w:rFonts w:ascii="Arial" w:hAnsi="Arial" w:eastAsia="Arial" w:cs="Arial"/>
+          <w:b w:val="0"/>
+          <w:i w:val="0"/>
+          <w:color w:val="000000"/>
+          <w:sz w:val="18"/>
+          <w:highlight w:val="lightGray"/>
+        </w:rPr>
+        <w:t>m</w:t>
+      </w:r>
+      <w:r>
+        <w:rPr>
+          <w:rFonts w:ascii="Arial" w:hAnsi="Arial" w:eastAsia="Arial" w:cs="Arial"/>
+          <w:b w:val="0"/>
+          <w:i w:val="0"/>
+          <w:color w:val="000000"/>
+          <w:sz w:val="18"/>
+          <w:highlight w:val="lightGray"/>
+        </w:rPr>
+        <w:t>n</w:t>
+      </w:r>
+      <w:r>
+        <w:rPr>
+          <w:rFonts w:ascii="Arial" w:hAnsi="Arial" w:eastAsia="Arial" w:cs="Arial"/>
+          <w:b w:val="0"/>
+          <w:i w:val="0"/>
+          <w:color w:val="000000"/>
+          <w:sz w:val="18"/>
+          <w:highlight w:val="lightGray"/>
+        </w:rPr>
+        <w:t>:</w:t>
+      </w:r>
+      <w:r>
+        <w:rPr>
+          <w:rFonts w:ascii="Arial" w:hAnsi="Arial" w:eastAsia="Arial" w:cs="Arial"/>
+          <w:b w:val="0"/>
+          <w:i w:val="0"/>
+          <w:color w:val="000000"/>
+          <w:sz w:val="18"/>
+          <w:highlight w:val="lightGray"/>
+        </w:rPr>
+        <w:t xml:space="preserve"> </w:t>
+      </w:r>
+      <w:r>
+        <w:rPr>
+          <w:rFonts w:ascii="Arial" w:hAnsi="Arial" w:eastAsia="Arial" w:cs="Arial"/>
+          <w:b w:val="0"/>
+          <w:i w:val="0"/>
+          <w:color w:val="000000"/>
+          <w:sz w:val="18"/>
+          <w:highlight w:val="lightGray"/>
+        </w:rPr>
+        <w:t>M</w:t>
+      </w:r>
+      <w:r>
+        <w:rPr>
+          <w:rFonts w:ascii="Arial" w:hAnsi="Arial" w:eastAsia="Arial" w:cs="Arial"/>
+          <w:b w:val="0"/>
+          <w:i w:val="0"/>
+          <w:color w:val="000000"/>
+          <w:sz w:val="18"/>
+          <w:highlight w:val="lightGray"/>
+        </w:rPr>
+        <w:t>o</w:t>
+      </w:r>
+      <w:r>
+        <w:rPr>
+          <w:rFonts w:ascii="Arial" w:hAnsi="Arial" w:eastAsia="Arial" w:cs="Arial"/>
+          <w:b w:val="0"/>
+          <w:i w:val="0"/>
+          <w:color w:val="000000"/>
+          <w:sz w:val="18"/>
+          <w:highlight w:val="lightGray"/>
+        </w:rPr>
+        <w:t>t</w:t>
+      </w:r>
+      <w:r>
+        <w:rPr>
+          <w:rFonts w:ascii="Arial" w:hAnsi="Arial" w:eastAsia="Arial" w:cs="Arial"/>
+          <w:b w:val="0"/>
+          <w:i w:val="0"/>
+          <w:color w:val="000000"/>
+          <w:sz w:val="18"/>
+          <w:highlight w:val="lightGray"/>
+        </w:rPr>
+        <w:t>a</w:t>
+      </w:r>
+      <w:r>
+        <w:rPr>
+          <w:rFonts w:ascii="Arial" w:hAnsi="Arial" w:eastAsia="Arial" w:cs="Arial"/>
+          <w:b w:val="0"/>
+          <w:i w:val="0"/>
+          <w:color w:val="000000"/>
+          <w:sz w:val="18"/>
+          <w:highlight w:val="lightGray"/>
+        </w:rPr>
+        <w:t>s</w:t>
+      </w:r>
+      <w:r>
+        <w:rPr>
+          <w:rFonts w:ascii="Arial" w:hAnsi="Arial" w:eastAsia="Arial" w:cs="Arial"/>
+          <w:b w:val="0"/>
+          <w:i w:val="0"/>
+          <w:color w:val="000000"/>
+          <w:sz w:val="18"/>
+          <w:highlight w:val="lightGray"/>
+        </w:rPr>
+        <w:t>e</w:t>
+      </w:r>
+      <w:r>
+        <w:rPr>
+          <w:rFonts w:ascii="Arial" w:hAnsi="Arial" w:eastAsia="Arial" w:cs="Arial"/>
+          <w:b w:val="0"/>
+          <w:i w:val="0"/>
+          <w:color w:val="000000"/>
+          <w:sz w:val="18"/>
+          <w:highlight w:val="lightGray"/>
+        </w:rPr>
+        <w:t>m</w:t>
+      </w:r>
+      <w:r>
+        <w:rPr>
+          <w:rFonts w:ascii="Arial" w:hAnsi="Arial" w:eastAsia="Arial" w:cs="Arial"/>
+          <w:b w:val="0"/>
+          <w:i w:val="0"/>
+          <w:color w:val="000000"/>
+          <w:sz w:val="18"/>
+          <w:highlight w:val="lightGray"/>
+        </w:rPr>
+        <w:t xml:space="preserve"> </w:t>
+      </w:r>
+      <w:r>
+        <w:rPr>
+          <w:rFonts w:ascii="Arial" w:hAnsi="Arial" w:eastAsia="Arial" w:cs="Arial"/>
+          <w:b w:val="0"/>
+          <w:i w:val="0"/>
+          <w:color w:val="000000"/>
+          <w:sz w:val="18"/>
+          <w:highlight w:val="lightGray"/>
+        </w:rPr>
+        <w:t>E</w:t>
+      </w:r>
+      <w:r>
+        <w:rPr>
+          <w:rFonts w:ascii="Arial" w:hAnsi="Arial" w:eastAsia="Arial" w:cs="Arial"/>
+          <w:b w:val="0"/>
+          <w:i w:val="0"/>
+          <w:color w:val="000000"/>
+          <w:sz w:val="18"/>
+          <w:highlight w:val="lightGray"/>
+        </w:rPr>
+        <w:t>s</w:t>
+      </w:r>
+      <w:r>
+        <w:rPr>
+          <w:rFonts w:ascii="Arial" w:hAnsi="Arial" w:eastAsia="Arial" w:cs="Arial"/>
+          <w:b w:val="0"/>
+          <w:i w:val="0"/>
+          <w:color w:val="000000"/>
+          <w:sz w:val="18"/>
+          <w:highlight w:val="lightGray"/>
+        </w:rPr>
+        <w:t>s</w:t>
+      </w:r>
+      <w:r>
+        <w:rPr>
+          <w:rFonts w:ascii="Arial" w:hAnsi="Arial" w:eastAsia="Arial" w:cs="Arial"/>
+          <w:b w:val="0"/>
+          <w:i w:val="0"/>
+          <w:color w:val="000000"/>
+          <w:sz w:val="18"/>
+          <w:highlight w:val="lightGray"/>
+        </w:rPr>
+        <w:t>a</w:t>
+      </w:r>
+      <w:r>
+        <w:rPr>
+          <w:rFonts w:ascii="Arial" w:hAnsi="Arial" w:eastAsia="Arial" w:cs="Arial"/>
+          <w:b w:val="0"/>
+          <w:i w:val="0"/>
+          <w:color w:val="000000"/>
+          <w:sz w:val="18"/>
+          <w:highlight w:val="lightGray"/>
+        </w:rPr>
+        <w:t>m</w:t>
+      </w:r>
+      <w:r>
+        <w:rPr>
+          <w:rFonts w:ascii="Arial" w:hAnsi="Arial" w:eastAsia="Arial" w:cs="Arial"/>
+          <w:b w:val="0"/>
+          <w:i w:val="0"/>
+          <w:color w:val="000000"/>
+          <w:sz w:val="18"/>
+          <w:highlight w:val="lightGray"/>
+        </w:rPr>
+        <w:t>]</w:t>
+      </w:r>
+      <w:r>
+        <w:rPr>
+          <w:rFonts w:ascii="Arial" w:hAnsi="Arial" w:eastAsia="Arial" w:cs="Arial"/>
+          <w:b w:val="0"/>
+          <w:i w:val="0"/>
+          <w:color w:val="000000"/>
+          <w:sz w:val="18"/>
+          <w:highlight w:val="lightGray"/>
+        </w:rPr>
+        <w:t xml:space="preserve"> </w:t>
+      </w:r>
+      <w:r>
+        <w:rPr>
+          <w:rFonts w:ascii="Arial" w:hAnsi="Arial" w:eastAsia="Arial" w:cs="Arial"/>
+          <w:b w:val="0"/>
+          <w:i w:val="0"/>
+          <w:color w:val="000000"/>
+          <w:sz w:val="18"/>
+          <w:highlight w:val="lightGray"/>
+        </w:rPr>
+        <w:t>-</w:t>
+      </w:r>
+      <w:r>
+        <w:rPr>
+          <w:rFonts w:ascii="Arial" w:hAnsi="Arial" w:eastAsia="Arial" w:cs="Arial"/>
+          <w:b w:val="0"/>
+          <w:i w:val="0"/>
+          <w:color w:val="000000"/>
+          <w:sz w:val="18"/>
+          <w:highlight w:val="lightGray"/>
+        </w:rPr>
+        <w:t>&gt;</w:t>
+      </w:r>
+      <w:r>
+        <w:rPr>
+          <w:rFonts w:ascii="Arial" w:hAnsi="Arial" w:eastAsia="Arial" w:cs="Arial"/>
+          <w:b w:val="0"/>
+          <w:i w:val="0"/>
+          <w:color w:val="000000"/>
+          <w:sz w:val="18"/>
+          <w:highlight w:val="lightGray"/>
+        </w:rPr>
+        <w:t xml:space="preserve"> </w:t>
+      </w:r>
+      <w:r>
+        <w:rPr>
+          <w:rFonts w:ascii="Arial" w:hAnsi="Arial" w:eastAsia="Arial" w:cs="Arial"/>
+          <w:b/>
+          <w:i w:val="0"/>
+          <w:color w:val="000000"/>
+          <w:sz w:val="18"/>
+          <w:highlight w:val="lightGray"/>
+        </w:rPr>
+        <w:t>F</w:t>
+      </w:r>
+      <w:r>
+        <w:rPr>
+          <w:rFonts w:ascii="Arial" w:hAnsi="Arial" w:eastAsia="Arial" w:cs="Arial"/>
+          <w:b/>
+          <w:i w:val="0"/>
+          <w:color w:val="000000"/>
+          <w:sz w:val="18"/>
+          <w:highlight w:val="lightGray"/>
+        </w:rPr>
+        <w:t>r</w:t>
+      </w:r>
+      <w:r>
+        <w:rPr>
+          <w:rFonts w:ascii="Arial" w:hAnsi="Arial" w:eastAsia="Arial" w:cs="Arial"/>
+          <w:b/>
+          <w:i w:val="0"/>
+          <w:color w:val="000000"/>
+          <w:sz w:val="18"/>
+          <w:highlight w:val="lightGray"/>
+        </w:rPr>
+        <w:t>o</w:t>
+      </w:r>
+      <w:r>
+        <w:rPr>
+          <w:rFonts w:ascii="Arial" w:hAnsi="Arial" w:eastAsia="Arial" w:cs="Arial"/>
+          <w:b/>
+          <w:i w:val="0"/>
+          <w:color w:val="000000"/>
+          <w:sz w:val="18"/>
+          <w:highlight w:val="lightGray"/>
+        </w:rPr>
+        <w:t>m</w:t>
+      </w:r>
+      <w:r>
+        <w:rPr>
+          <w:rFonts w:ascii="Arial" w:hAnsi="Arial" w:eastAsia="Arial" w:cs="Arial"/>
+          <w:b/>
+          <w:i w:val="0"/>
+          <w:color w:val="000000"/>
+          <w:sz w:val="18"/>
+          <w:highlight w:val="lightGray"/>
+        </w:rPr>
+        <w:t>:</w:t>
+      </w:r>
+      <w:r>
+        <w:rPr>
+          <w:rFonts w:ascii="Arial" w:hAnsi="Arial" w:eastAsia="Arial" w:cs="Arial"/>
+          <w:b w:val="0"/>
+          <w:i w:val="0"/>
+          <w:color w:val="000000"/>
+          <w:sz w:val="18"/>
+          <w:highlight w:val="lightGray"/>
+        </w:rPr>
+        <w:t xml:space="preserve"> </w:t>
+      </w:r>
+      <w:r>
+        <w:rPr>
+          <w:rFonts w:ascii="Arial" w:hAnsi="Arial" w:eastAsia="Arial" w:cs="Arial"/>
+          <w:b w:val="0"/>
+          <w:i w:val="0"/>
+          <w:color w:val="000000"/>
+          <w:sz w:val="18"/>
+          <w:highlight w:val="lightGray"/>
+        </w:rPr>
+        <w:t>[</w:t>
+      </w:r>
+      <w:r>
+        <w:rPr>
+          <w:rFonts w:ascii="Arial" w:hAnsi="Arial" w:eastAsia="Arial" w:cs="Arial"/>
+          <w:b w:val="0"/>
+          <w:i w:val="0"/>
+          <w:color w:val="000000"/>
+          <w:sz w:val="18"/>
+          <w:highlight w:val="lightGray"/>
+        </w:rPr>
+        <w:t>C</w:t>
+      </w:r>
+      <w:r>
+        <w:rPr>
+          <w:rFonts w:ascii="Arial" w:hAnsi="Arial" w:eastAsia="Arial" w:cs="Arial"/>
+          <w:b w:val="0"/>
+          <w:i w:val="0"/>
+          <w:color w:val="000000"/>
+          <w:sz w:val="18"/>
+          <w:highlight w:val="lightGray"/>
+        </w:rPr>
+        <w:t>h</w:t>
+      </w:r>
+      <w:r>
+        <w:rPr>
+          <w:rFonts w:ascii="Arial" w:hAnsi="Arial" w:eastAsia="Arial" w:cs="Arial"/>
+          <w:b w:val="0"/>
+          <w:i w:val="0"/>
+          <w:color w:val="000000"/>
+          <w:sz w:val="18"/>
+          <w:highlight w:val="lightGray"/>
+        </w:rPr>
+        <w:t>a</w:t>
+      </w:r>
+      <w:r>
+        <w:rPr>
+          <w:rFonts w:ascii="Arial" w:hAnsi="Arial" w:eastAsia="Arial" w:cs="Arial"/>
+          <w:b w:val="0"/>
+          <w:i w:val="0"/>
+          <w:color w:val="000000"/>
+          <w:sz w:val="18"/>
+          <w:highlight w:val="lightGray"/>
+        </w:rPr>
+        <w:t>t</w:t>
+      </w:r>
+      <w:r>
+        <w:rPr>
+          <w:rFonts w:ascii="Arial" w:hAnsi="Arial" w:eastAsia="Arial" w:cs="Arial"/>
+          <w:b w:val="0"/>
+          <w:i w:val="0"/>
+          <w:color w:val="000000"/>
+          <w:sz w:val="18"/>
+          <w:highlight w:val="lightGray"/>
+        </w:rPr>
+        <w:t>G</w:t>
+      </w:r>
+      <w:r>
+        <w:rPr>
+          <w:rFonts w:ascii="Arial" w:hAnsi="Arial" w:eastAsia="Arial" w:cs="Arial"/>
+          <w:b w:val="0"/>
+          <w:i w:val="0"/>
+          <w:color w:val="000000"/>
+          <w:sz w:val="18"/>
+          <w:highlight w:val="lightGray"/>
+        </w:rPr>
+        <w:t>P</w:t>
+      </w:r>
+      <w:r>
+        <w:rPr>
+          <w:rFonts w:ascii="Arial" w:hAnsi="Arial" w:eastAsia="Arial" w:cs="Arial"/>
+          <w:b w:val="0"/>
+          <w:i w:val="0"/>
+          <w:color w:val="000000"/>
+          <w:sz w:val="18"/>
+          <w:highlight w:val="lightGray"/>
+        </w:rPr>
+        <w:t>T</w:t>
+      </w:r>
+      <w:r>
+        <w:rPr>
+          <w:rFonts w:ascii="Arial" w:hAnsi="Arial" w:eastAsia="Arial" w:cs="Arial"/>
+          <w:b w:val="0"/>
+          <w:i w:val="0"/>
+          <w:color w:val="000000"/>
+          <w:sz w:val="18"/>
+          <w:highlight w:val="lightGray"/>
+        </w:rPr>
+        <w:t>]</w:t>
+      </w:r>
+      <w:r>
+        <w:rPr>
+          <w:rFonts w:ascii="Arial" w:hAnsi="Arial" w:eastAsia="Arial" w:cs="Arial"/>
+          <w:b w:val="0"/>
+          <w:i w:val="0"/>
+          <w:color w:val="000000"/>
+          <w:sz w:val="18"/>
+          <w:highlight w:val="lightGray"/>
+        </w:rPr>
+        <w:t xml:space="preserve"> </w:t>
+      </w:r>
+      <w:r>
+        <w:rPr>
+          <w:rFonts w:ascii="Arial" w:hAnsi="Arial" w:eastAsia="Arial" w:cs="Arial"/>
+          <w:b/>
+          <w:i w:val="0"/>
+          <w:color w:val="000000"/>
+          <w:sz w:val="18"/>
+          <w:highlight w:val="lightGray"/>
+        </w:rPr>
+        <w:t>o</w:t>
+      </w:r>
+      <w:r>
+        <w:rPr>
+          <w:rFonts w:ascii="Arial" w:hAnsi="Arial" w:eastAsia="Arial" w:cs="Arial"/>
+          <w:b/>
+          <w:i w:val="0"/>
+          <w:color w:val="000000"/>
+          <w:sz w:val="18"/>
+          <w:highlight w:val="lightGray"/>
+        </w:rPr>
+        <w:t>n</w:t>
+      </w:r>
+      <w:r>
+        <w:rPr>
+          <w:rFonts w:ascii="Arial" w:hAnsi="Arial" w:eastAsia="Arial" w:cs="Arial"/>
+          <w:b/>
+          <w:i w:val="0"/>
+          <w:color w:val="000000"/>
+          <w:sz w:val="18"/>
+          <w:highlight w:val="lightGray"/>
+        </w:rPr>
+        <w:t xml:space="preserve"> </w:t>
+      </w:r>
+      <w:r>
+        <w:rPr>
+          <w:rFonts w:ascii="Arial" w:hAnsi="Arial" w:eastAsia="Arial" w:cs="Arial"/>
+          <w:b w:val="0"/>
+          <w:i w:val="0"/>
+          <w:color w:val="000000"/>
+          <w:sz w:val="18"/>
+          <w:highlight w:val="lightGray"/>
+        </w:rPr>
+        <w:t>[</w:t>
+      </w:r>
+      <w:r>
+        <w:rPr>
+          <w:rFonts w:ascii="Arial" w:hAnsi="Arial" w:eastAsia="Arial" w:cs="Arial"/>
+          <w:b w:val="0"/>
+          <w:i w:val="0"/>
+          <w:color w:val="000000"/>
+          <w:sz w:val="18"/>
+          <w:highlight w:val="lightGray"/>
+        </w:rPr>
+        <w:t>7</w:t>
+      </w:r>
+      <w:r>
+        <w:rPr>
+          <w:rFonts w:ascii="Arial" w:hAnsi="Arial" w:eastAsia="Arial" w:cs="Arial"/>
+          <w:b w:val="0"/>
+          <w:i w:val="0"/>
+          <w:color w:val="000000"/>
+          <w:sz w:val="18"/>
+          <w:highlight w:val="lightGray"/>
+        </w:rPr>
+        <w:t>/</w:t>
+      </w:r>
+      <w:r>
+        <w:rPr>
+          <w:rFonts w:ascii="Arial" w:hAnsi="Arial" w:eastAsia="Arial" w:cs="Arial"/>
+          <w:b w:val="0"/>
+          <w:i w:val="0"/>
+          <w:color w:val="000000"/>
+          <w:sz w:val="18"/>
+          <w:highlight w:val="lightGray"/>
+        </w:rPr>
+        <w:t>2</w:t>
+      </w:r>
+      <w:r>
+        <w:rPr>
+          <w:rFonts w:ascii="Arial" w:hAnsi="Arial" w:eastAsia="Arial" w:cs="Arial"/>
+          <w:b w:val="0"/>
+          <w:i w:val="0"/>
+          <w:color w:val="000000"/>
+          <w:sz w:val="18"/>
+          <w:highlight w:val="lightGray"/>
+        </w:rPr>
+        <w:t>1</w:t>
+      </w:r>
+      <w:r>
+        <w:rPr>
+          <w:rFonts w:ascii="Arial" w:hAnsi="Arial" w:eastAsia="Arial" w:cs="Arial"/>
+          <w:b w:val="0"/>
+          <w:i w:val="0"/>
+          <w:color w:val="000000"/>
+          <w:sz w:val="18"/>
+          <w:highlight w:val="lightGray"/>
+        </w:rPr>
+        <w:t>/</w:t>
+      </w:r>
+      <w:r>
+        <w:rPr>
+          <w:rFonts w:ascii="Arial" w:hAnsi="Arial" w:eastAsia="Arial" w:cs="Arial"/>
+          <w:b w:val="0"/>
+          <w:i w:val="0"/>
+          <w:color w:val="000000"/>
+          <w:sz w:val="18"/>
+          <w:highlight w:val="lightGray"/>
+        </w:rPr>
+        <w:t>2</w:t>
+      </w:r>
+      <w:r>
+        <w:rPr>
+          <w:rFonts w:ascii="Arial" w:hAnsi="Arial" w:eastAsia="Arial" w:cs="Arial"/>
+          <w:b w:val="0"/>
+          <w:i w:val="0"/>
+          <w:color w:val="000000"/>
+          <w:sz w:val="18"/>
+          <w:highlight w:val="lightGray"/>
+        </w:rPr>
+        <w:t>0</w:t>
+      </w:r>
+      <w:r>
+        <w:rPr>
+          <w:rFonts w:ascii="Arial" w:hAnsi="Arial" w:eastAsia="Arial" w:cs="Arial"/>
+          <w:b w:val="0"/>
+          <w:i w:val="0"/>
+          <w:color w:val="000000"/>
+          <w:sz w:val="18"/>
+          <w:highlight w:val="lightGray"/>
+        </w:rPr>
+        <w:t>2</w:t>
+      </w:r>
+      <w:r>
+        <w:rPr>
+          <w:rFonts w:ascii="Arial" w:hAnsi="Arial" w:eastAsia="Arial" w:cs="Arial"/>
+          <w:b w:val="0"/>
+          <w:i w:val="0"/>
+          <w:color w:val="000000"/>
+          <w:sz w:val="18"/>
+          <w:highlight w:val="lightGray"/>
+        </w:rPr>
+        <w:t>5</w:t>
+      </w:r>
+      <w:r>
+        <w:rPr>
+          <w:rFonts w:ascii="Arial" w:hAnsi="Arial" w:eastAsia="Arial" w:cs="Arial"/>
+          <w:b w:val="0"/>
+          <w:i w:val="0"/>
+          <w:color w:val="000000"/>
+          <w:sz w:val="18"/>
+          <w:highlight w:val="lightGray"/>
+        </w:rPr>
+        <w:t>]</w:t>
       </w:r>
     </w:p>
     <w:p>
@@ -6385,60 +7879,1554 @@
       </w:pPr>
       <w:r>
         <w:rPr>
-          <w:rFonts w:ascii="Arial" w:eastAsia="Arial" w:hAnsi="Arial"/>
-          <w:b/>
-          <w:color w:val="000000"/>
-          <w:sz w:val="18"/>
-          <w:highlight w:val="lightGray"/>
-        </w:rPr>
-        <w:t># Source: AI Source: Provided by: [Data Path</w:t>
-      </w:r>
-      <w:r>
-        <w:rPr>
-          <w:rFonts w:ascii="Arial" w:eastAsia="Arial" w:hAnsi="Arial"/>
-          <w:color w:val="000000"/>
-          <w:sz w:val="18"/>
-          <w:highlight w:val="lightGray"/>
-        </w:rPr>
-        <w:t xml:space="preserve">: Persons Table -&gt; ID Column: 1, Name_En Column: Motasem Essam] -&gt; </w:t>
-      </w:r>
-      <w:r>
-        <w:rPr>
-          <w:rFonts w:ascii="Arial" w:eastAsia="Arial" w:hAnsi="Arial"/>
-          <w:b/>
-          <w:color w:val="000000"/>
-          <w:sz w:val="18"/>
-          <w:highlight w:val="lightGray"/>
-        </w:rPr>
-        <w:t>From:</w:t>
-      </w:r>
-      <w:r>
-        <w:rPr>
-          <w:rFonts w:ascii="Arial" w:eastAsia="Arial" w:hAnsi="Arial"/>
-          <w:color w:val="000000"/>
-          <w:sz w:val="18"/>
-          <w:highlight w:val="lightGray"/>
-        </w:rPr>
-        <w:t xml:space="preserve"> [Chatgpt (GPT-4-turbo)] </w:t>
-      </w:r>
-      <w:r>
-        <w:rPr>
-          <w:rFonts w:ascii="Arial" w:eastAsia="Arial" w:hAnsi="Arial"/>
-          <w:b/>
-          <w:color w:val="000000"/>
-          <w:sz w:val="18"/>
-          <w:highlight w:val="lightGray"/>
-        </w:rPr>
-        <w:t xml:space="preserve">on </w:t>
-      </w:r>
-      <w:r>
-        <w:rPr>
-          <w:rFonts w:ascii="Arial" w:eastAsia="Arial" w:hAnsi="Arial"/>
-          <w:color w:val="000000"/>
-          <w:sz w:val="18"/>
-          <w:highlight w:val="lightGray"/>
-        </w:rPr>
-        <w:t>[7/21/2025]</w:t>
+          <w:rFonts w:ascii="Arial" w:hAnsi="Arial" w:eastAsia="Arial" w:cs="Arial"/>
+          <w:b/>
+          <w:i w:val="0"/>
+          <w:color w:val="000000"/>
+          <w:sz w:val="18"/>
+          <w:highlight w:val="lightGray"/>
+        </w:rPr>
+        <w:t>#</w:t>
+      </w:r>
+      <w:r>
+        <w:rPr>
+          <w:rFonts w:ascii="Arial" w:hAnsi="Arial" w:eastAsia="Arial" w:cs="Arial"/>
+          <w:b/>
+          <w:i w:val="0"/>
+          <w:color w:val="000000"/>
+          <w:sz w:val="18"/>
+          <w:highlight w:val="lightGray"/>
+        </w:rPr>
+        <w:t xml:space="preserve"> </w:t>
+      </w:r>
+      <w:r>
+        <w:rPr>
+          <w:rFonts w:ascii="Arial" w:hAnsi="Arial" w:eastAsia="Arial" w:cs="Arial"/>
+          <w:b/>
+          <w:i w:val="0"/>
+          <w:color w:val="000000"/>
+          <w:sz w:val="18"/>
+          <w:highlight w:val="lightGray"/>
+        </w:rPr>
+        <w:t>S</w:t>
+      </w:r>
+      <w:r>
+        <w:rPr>
+          <w:rFonts w:ascii="Arial" w:hAnsi="Arial" w:eastAsia="Arial" w:cs="Arial"/>
+          <w:b/>
+          <w:i w:val="0"/>
+          <w:color w:val="000000"/>
+          <w:sz w:val="18"/>
+          <w:highlight w:val="lightGray"/>
+        </w:rPr>
+        <w:t>o</w:t>
+      </w:r>
+      <w:r>
+        <w:rPr>
+          <w:rFonts w:ascii="Arial" w:hAnsi="Arial" w:eastAsia="Arial" w:cs="Arial"/>
+          <w:b/>
+          <w:i w:val="0"/>
+          <w:color w:val="000000"/>
+          <w:sz w:val="18"/>
+          <w:highlight w:val="lightGray"/>
+        </w:rPr>
+        <w:t>u</w:t>
+      </w:r>
+      <w:r>
+        <w:rPr>
+          <w:rFonts w:ascii="Arial" w:hAnsi="Arial" w:eastAsia="Arial" w:cs="Arial"/>
+          <w:b/>
+          <w:i w:val="0"/>
+          <w:color w:val="000000"/>
+          <w:sz w:val="18"/>
+          <w:highlight w:val="lightGray"/>
+        </w:rPr>
+        <w:t>r</w:t>
+      </w:r>
+      <w:r>
+        <w:rPr>
+          <w:rFonts w:ascii="Arial" w:hAnsi="Arial" w:eastAsia="Arial" w:cs="Arial"/>
+          <w:b/>
+          <w:i w:val="0"/>
+          <w:color w:val="000000"/>
+          <w:sz w:val="18"/>
+          <w:highlight w:val="lightGray"/>
+        </w:rPr>
+        <w:t>c</w:t>
+      </w:r>
+      <w:r>
+        <w:rPr>
+          <w:rFonts w:ascii="Arial" w:hAnsi="Arial" w:eastAsia="Arial" w:cs="Arial"/>
+          <w:b/>
+          <w:i w:val="0"/>
+          <w:color w:val="000000"/>
+          <w:sz w:val="18"/>
+          <w:highlight w:val="lightGray"/>
+        </w:rPr>
+        <w:t>e</w:t>
+      </w:r>
+      <w:r>
+        <w:rPr>
+          <w:rFonts w:ascii="Arial" w:hAnsi="Arial" w:eastAsia="Arial" w:cs="Arial"/>
+          <w:b/>
+          <w:i w:val="0"/>
+          <w:color w:val="000000"/>
+          <w:sz w:val="18"/>
+          <w:highlight w:val="lightGray"/>
+        </w:rPr>
+        <w:t>:</w:t>
+      </w:r>
+      <w:r>
+        <w:rPr>
+          <w:rFonts w:ascii="Arial" w:hAnsi="Arial" w:eastAsia="Arial" w:cs="Arial"/>
+          <w:b/>
+          <w:i w:val="0"/>
+          <w:color w:val="000000"/>
+          <w:sz w:val="18"/>
+          <w:highlight w:val="lightGray"/>
+        </w:rPr>
+        <w:t xml:space="preserve"> </w:t>
+      </w:r>
+      <w:r>
+        <w:rPr>
+          <w:rFonts w:ascii="Arial" w:hAnsi="Arial" w:eastAsia="Arial" w:cs="Arial"/>
+          <w:b/>
+          <w:i w:val="0"/>
+          <w:color w:val="000000"/>
+          <w:sz w:val="18"/>
+          <w:highlight w:val="lightGray"/>
+        </w:rPr>
+        <w:t>A</w:t>
+      </w:r>
+      <w:r>
+        <w:rPr>
+          <w:rFonts w:ascii="Arial" w:hAnsi="Arial" w:eastAsia="Arial" w:cs="Arial"/>
+          <w:b/>
+          <w:i w:val="0"/>
+          <w:color w:val="000000"/>
+          <w:sz w:val="18"/>
+          <w:highlight w:val="lightGray"/>
+        </w:rPr>
+        <w:t>I</w:t>
+      </w:r>
+      <w:r>
+        <w:rPr>
+          <w:rFonts w:ascii="Arial" w:hAnsi="Arial" w:eastAsia="Arial" w:cs="Arial"/>
+          <w:b/>
+          <w:i w:val="0"/>
+          <w:color w:val="000000"/>
+          <w:sz w:val="18"/>
+          <w:highlight w:val="lightGray"/>
+        </w:rPr>
+        <w:t xml:space="preserve"> </w:t>
+      </w:r>
+      <w:r>
+        <w:rPr>
+          <w:rFonts w:ascii="Arial" w:hAnsi="Arial" w:eastAsia="Arial" w:cs="Arial"/>
+          <w:b/>
+          <w:i w:val="0"/>
+          <w:color w:val="000000"/>
+          <w:sz w:val="18"/>
+          <w:highlight w:val="lightGray"/>
+        </w:rPr>
+        <w:t>S</w:t>
+      </w:r>
+      <w:r>
+        <w:rPr>
+          <w:rFonts w:ascii="Arial" w:hAnsi="Arial" w:eastAsia="Arial" w:cs="Arial"/>
+          <w:b/>
+          <w:i w:val="0"/>
+          <w:color w:val="000000"/>
+          <w:sz w:val="18"/>
+          <w:highlight w:val="lightGray"/>
+        </w:rPr>
+        <w:t>o</w:t>
+      </w:r>
+      <w:r>
+        <w:rPr>
+          <w:rFonts w:ascii="Arial" w:hAnsi="Arial" w:eastAsia="Arial" w:cs="Arial"/>
+          <w:b/>
+          <w:i w:val="0"/>
+          <w:color w:val="000000"/>
+          <w:sz w:val="18"/>
+          <w:highlight w:val="lightGray"/>
+        </w:rPr>
+        <w:t>u</w:t>
+      </w:r>
+      <w:r>
+        <w:rPr>
+          <w:rFonts w:ascii="Arial" w:hAnsi="Arial" w:eastAsia="Arial" w:cs="Arial"/>
+          <w:b/>
+          <w:i w:val="0"/>
+          <w:color w:val="000000"/>
+          <w:sz w:val="18"/>
+          <w:highlight w:val="lightGray"/>
+        </w:rPr>
+        <w:t>r</w:t>
+      </w:r>
+      <w:r>
+        <w:rPr>
+          <w:rFonts w:ascii="Arial" w:hAnsi="Arial" w:eastAsia="Arial" w:cs="Arial"/>
+          <w:b/>
+          <w:i w:val="0"/>
+          <w:color w:val="000000"/>
+          <w:sz w:val="18"/>
+          <w:highlight w:val="lightGray"/>
+        </w:rPr>
+        <w:t>c</w:t>
+      </w:r>
+      <w:r>
+        <w:rPr>
+          <w:rFonts w:ascii="Arial" w:hAnsi="Arial" w:eastAsia="Arial" w:cs="Arial"/>
+          <w:b/>
+          <w:i w:val="0"/>
+          <w:color w:val="000000"/>
+          <w:sz w:val="18"/>
+          <w:highlight w:val="lightGray"/>
+        </w:rPr>
+        <w:t>e</w:t>
+      </w:r>
+      <w:r>
+        <w:rPr>
+          <w:rFonts w:ascii="Arial" w:hAnsi="Arial" w:eastAsia="Arial" w:cs="Arial"/>
+          <w:b/>
+          <w:i w:val="0"/>
+          <w:color w:val="000000"/>
+          <w:sz w:val="18"/>
+          <w:highlight w:val="lightGray"/>
+        </w:rPr>
+        <w:t>:</w:t>
+      </w:r>
+      <w:r>
+        <w:rPr>
+          <w:rFonts w:ascii="Arial" w:hAnsi="Arial" w:eastAsia="Arial" w:cs="Arial"/>
+          <w:b/>
+          <w:i w:val="0"/>
+          <w:color w:val="000000"/>
+          <w:sz w:val="18"/>
+          <w:highlight w:val="lightGray"/>
+        </w:rPr>
+        <w:t xml:space="preserve"> </w:t>
+      </w:r>
+      <w:r>
+        <w:rPr>
+          <w:rFonts w:ascii="Arial" w:hAnsi="Arial" w:eastAsia="Arial" w:cs="Arial"/>
+          <w:b/>
+          <w:i w:val="0"/>
+          <w:color w:val="000000"/>
+          <w:sz w:val="18"/>
+          <w:highlight w:val="lightGray"/>
+        </w:rPr>
+        <w:t>P</w:t>
+      </w:r>
+      <w:r>
+        <w:rPr>
+          <w:rFonts w:ascii="Arial" w:hAnsi="Arial" w:eastAsia="Arial" w:cs="Arial"/>
+          <w:b/>
+          <w:i w:val="0"/>
+          <w:color w:val="000000"/>
+          <w:sz w:val="18"/>
+          <w:highlight w:val="lightGray"/>
+        </w:rPr>
+        <w:t>r</w:t>
+      </w:r>
+      <w:r>
+        <w:rPr>
+          <w:rFonts w:ascii="Arial" w:hAnsi="Arial" w:eastAsia="Arial" w:cs="Arial"/>
+          <w:b/>
+          <w:i w:val="0"/>
+          <w:color w:val="000000"/>
+          <w:sz w:val="18"/>
+          <w:highlight w:val="lightGray"/>
+        </w:rPr>
+        <w:t>o</w:t>
+      </w:r>
+      <w:r>
+        <w:rPr>
+          <w:rFonts w:ascii="Arial" w:hAnsi="Arial" w:eastAsia="Arial" w:cs="Arial"/>
+          <w:b/>
+          <w:i w:val="0"/>
+          <w:color w:val="000000"/>
+          <w:sz w:val="18"/>
+          <w:highlight w:val="lightGray"/>
+        </w:rPr>
+        <w:t>v</w:t>
+      </w:r>
+      <w:r>
+        <w:rPr>
+          <w:rFonts w:ascii="Arial" w:hAnsi="Arial" w:eastAsia="Arial" w:cs="Arial"/>
+          <w:b/>
+          <w:i w:val="0"/>
+          <w:color w:val="000000"/>
+          <w:sz w:val="18"/>
+          <w:highlight w:val="lightGray"/>
+        </w:rPr>
+        <w:t>i</w:t>
+      </w:r>
+      <w:r>
+        <w:rPr>
+          <w:rFonts w:ascii="Arial" w:hAnsi="Arial" w:eastAsia="Arial" w:cs="Arial"/>
+          <w:b/>
+          <w:i w:val="0"/>
+          <w:color w:val="000000"/>
+          <w:sz w:val="18"/>
+          <w:highlight w:val="lightGray"/>
+        </w:rPr>
+        <w:t>d</w:t>
+      </w:r>
+      <w:r>
+        <w:rPr>
+          <w:rFonts w:ascii="Arial" w:hAnsi="Arial" w:eastAsia="Arial" w:cs="Arial"/>
+          <w:b/>
+          <w:i w:val="0"/>
+          <w:color w:val="000000"/>
+          <w:sz w:val="18"/>
+          <w:highlight w:val="lightGray"/>
+        </w:rPr>
+        <w:t>e</w:t>
+      </w:r>
+      <w:r>
+        <w:rPr>
+          <w:rFonts w:ascii="Arial" w:hAnsi="Arial" w:eastAsia="Arial" w:cs="Arial"/>
+          <w:b/>
+          <w:i w:val="0"/>
+          <w:color w:val="000000"/>
+          <w:sz w:val="18"/>
+          <w:highlight w:val="lightGray"/>
+        </w:rPr>
+        <w:t>d</w:t>
+      </w:r>
+      <w:r>
+        <w:rPr>
+          <w:rFonts w:ascii="Arial" w:hAnsi="Arial" w:eastAsia="Arial" w:cs="Arial"/>
+          <w:b/>
+          <w:i w:val="0"/>
+          <w:color w:val="000000"/>
+          <w:sz w:val="18"/>
+          <w:highlight w:val="lightGray"/>
+        </w:rPr>
+        <w:t xml:space="preserve"> </w:t>
+      </w:r>
+      <w:r>
+        <w:rPr>
+          <w:rFonts w:ascii="Arial" w:hAnsi="Arial" w:eastAsia="Arial" w:cs="Arial"/>
+          <w:b/>
+          <w:i w:val="0"/>
+          <w:color w:val="000000"/>
+          <w:sz w:val="18"/>
+          <w:highlight w:val="lightGray"/>
+        </w:rPr>
+        <w:t>b</w:t>
+      </w:r>
+      <w:r>
+        <w:rPr>
+          <w:rFonts w:ascii="Arial" w:hAnsi="Arial" w:eastAsia="Arial" w:cs="Arial"/>
+          <w:b/>
+          <w:i w:val="0"/>
+          <w:color w:val="000000"/>
+          <w:sz w:val="18"/>
+          <w:highlight w:val="lightGray"/>
+        </w:rPr>
+        <w:t>y</w:t>
+      </w:r>
+      <w:r>
+        <w:rPr>
+          <w:rFonts w:ascii="Arial" w:hAnsi="Arial" w:eastAsia="Arial" w:cs="Arial"/>
+          <w:b/>
+          <w:i w:val="0"/>
+          <w:color w:val="000000"/>
+          <w:sz w:val="18"/>
+          <w:highlight w:val="lightGray"/>
+        </w:rPr>
+        <w:t>:</w:t>
+      </w:r>
+      <w:r>
+        <w:rPr>
+          <w:rFonts w:ascii="Arial" w:hAnsi="Arial" w:eastAsia="Arial" w:cs="Arial"/>
+          <w:b/>
+          <w:i w:val="0"/>
+          <w:color w:val="000000"/>
+          <w:sz w:val="18"/>
+          <w:highlight w:val="lightGray"/>
+        </w:rPr>
+        <w:t xml:space="preserve"> </w:t>
+      </w:r>
+      <w:r>
+        <w:rPr>
+          <w:rFonts w:ascii="Arial" w:hAnsi="Arial" w:eastAsia="Arial" w:cs="Arial"/>
+          <w:b/>
+          <w:i w:val="0"/>
+          <w:color w:val="000000"/>
+          <w:sz w:val="18"/>
+          <w:highlight w:val="lightGray"/>
+        </w:rPr>
+        <w:t>[</w:t>
+      </w:r>
+      <w:r>
+        <w:rPr>
+          <w:rFonts w:ascii="Arial" w:hAnsi="Arial" w:eastAsia="Arial" w:cs="Arial"/>
+          <w:b/>
+          <w:i w:val="0"/>
+          <w:color w:val="000000"/>
+          <w:sz w:val="18"/>
+          <w:highlight w:val="lightGray"/>
+        </w:rPr>
+        <w:t>D</w:t>
+      </w:r>
+      <w:r>
+        <w:rPr>
+          <w:rFonts w:ascii="Arial" w:hAnsi="Arial" w:eastAsia="Arial" w:cs="Arial"/>
+          <w:b/>
+          <w:i w:val="0"/>
+          <w:color w:val="000000"/>
+          <w:sz w:val="18"/>
+          <w:highlight w:val="lightGray"/>
+        </w:rPr>
+        <w:t>a</w:t>
+      </w:r>
+      <w:r>
+        <w:rPr>
+          <w:rFonts w:ascii="Arial" w:hAnsi="Arial" w:eastAsia="Arial" w:cs="Arial"/>
+          <w:b/>
+          <w:i w:val="0"/>
+          <w:color w:val="000000"/>
+          <w:sz w:val="18"/>
+          <w:highlight w:val="lightGray"/>
+        </w:rPr>
+        <w:t>t</w:t>
+      </w:r>
+      <w:r>
+        <w:rPr>
+          <w:rFonts w:ascii="Arial" w:hAnsi="Arial" w:eastAsia="Arial" w:cs="Arial"/>
+          <w:b/>
+          <w:i w:val="0"/>
+          <w:color w:val="000000"/>
+          <w:sz w:val="18"/>
+          <w:highlight w:val="lightGray"/>
+        </w:rPr>
+        <w:t>a</w:t>
+      </w:r>
+      <w:r>
+        <w:rPr>
+          <w:rFonts w:ascii="Arial" w:hAnsi="Arial" w:eastAsia="Arial" w:cs="Arial"/>
+          <w:b/>
+          <w:i w:val="0"/>
+          <w:color w:val="000000"/>
+          <w:sz w:val="18"/>
+          <w:highlight w:val="lightGray"/>
+        </w:rPr>
+        <w:t xml:space="preserve"> </w:t>
+      </w:r>
+      <w:r>
+        <w:rPr>
+          <w:rFonts w:ascii="Arial" w:hAnsi="Arial" w:eastAsia="Arial" w:cs="Arial"/>
+          <w:b/>
+          <w:i w:val="0"/>
+          <w:color w:val="000000"/>
+          <w:sz w:val="18"/>
+          <w:highlight w:val="lightGray"/>
+        </w:rPr>
+        <w:t>P</w:t>
+      </w:r>
+      <w:r>
+        <w:rPr>
+          <w:rFonts w:ascii="Arial" w:hAnsi="Arial" w:eastAsia="Arial" w:cs="Arial"/>
+          <w:b/>
+          <w:i w:val="0"/>
+          <w:color w:val="000000"/>
+          <w:sz w:val="18"/>
+          <w:highlight w:val="lightGray"/>
+        </w:rPr>
+        <w:t>a</w:t>
+      </w:r>
+      <w:r>
+        <w:rPr>
+          <w:rFonts w:ascii="Arial" w:hAnsi="Arial" w:eastAsia="Arial" w:cs="Arial"/>
+          <w:b/>
+          <w:i w:val="0"/>
+          <w:color w:val="000000"/>
+          <w:sz w:val="18"/>
+          <w:highlight w:val="lightGray"/>
+        </w:rPr>
+        <w:t>t</w:t>
+      </w:r>
+      <w:r>
+        <w:rPr>
+          <w:rFonts w:ascii="Arial" w:hAnsi="Arial" w:eastAsia="Arial" w:cs="Arial"/>
+          <w:b/>
+          <w:i w:val="0"/>
+          <w:color w:val="000000"/>
+          <w:sz w:val="18"/>
+          <w:highlight w:val="lightGray"/>
+        </w:rPr>
+        <w:t>h</w:t>
+      </w:r>
+      <w:r>
+        <w:rPr>
+          <w:rFonts w:ascii="Arial" w:hAnsi="Arial" w:eastAsia="Arial" w:cs="Arial"/>
+          <w:b w:val="0"/>
+          <w:i w:val="0"/>
+          <w:color w:val="000000"/>
+          <w:sz w:val="18"/>
+          <w:highlight w:val="lightGray"/>
+        </w:rPr>
+        <w:t>:</w:t>
+      </w:r>
+      <w:r>
+        <w:rPr>
+          <w:rFonts w:ascii="Arial" w:hAnsi="Arial" w:eastAsia="Arial" w:cs="Arial"/>
+          <w:b w:val="0"/>
+          <w:i w:val="0"/>
+          <w:color w:val="000000"/>
+          <w:sz w:val="18"/>
+          <w:highlight w:val="lightGray"/>
+        </w:rPr>
+        <w:t xml:space="preserve"> </w:t>
+      </w:r>
+      <w:r>
+        <w:rPr>
+          <w:rFonts w:ascii="Arial" w:hAnsi="Arial" w:eastAsia="Arial" w:cs="Arial"/>
+          <w:b w:val="0"/>
+          <w:i w:val="0"/>
+          <w:color w:val="000000"/>
+          <w:sz w:val="18"/>
+          <w:highlight w:val="lightGray"/>
+        </w:rPr>
+        <w:t>P</w:t>
+      </w:r>
+      <w:r>
+        <w:rPr>
+          <w:rFonts w:ascii="Arial" w:hAnsi="Arial" w:eastAsia="Arial" w:cs="Arial"/>
+          <w:b w:val="0"/>
+          <w:i w:val="0"/>
+          <w:color w:val="000000"/>
+          <w:sz w:val="18"/>
+          <w:highlight w:val="lightGray"/>
+        </w:rPr>
+        <w:t>e</w:t>
+      </w:r>
+      <w:r>
+        <w:rPr>
+          <w:rFonts w:ascii="Arial" w:hAnsi="Arial" w:eastAsia="Arial" w:cs="Arial"/>
+          <w:b w:val="0"/>
+          <w:i w:val="0"/>
+          <w:color w:val="000000"/>
+          <w:sz w:val="18"/>
+          <w:highlight w:val="lightGray"/>
+        </w:rPr>
+        <w:t>r</w:t>
+      </w:r>
+      <w:r>
+        <w:rPr>
+          <w:rFonts w:ascii="Arial" w:hAnsi="Arial" w:eastAsia="Arial" w:cs="Arial"/>
+          <w:b w:val="0"/>
+          <w:i w:val="0"/>
+          <w:color w:val="000000"/>
+          <w:sz w:val="18"/>
+          <w:highlight w:val="lightGray"/>
+        </w:rPr>
+        <w:t>s</w:t>
+      </w:r>
+      <w:r>
+        <w:rPr>
+          <w:rFonts w:ascii="Arial" w:hAnsi="Arial" w:eastAsia="Arial" w:cs="Arial"/>
+          <w:b w:val="0"/>
+          <w:i w:val="0"/>
+          <w:color w:val="000000"/>
+          <w:sz w:val="18"/>
+          <w:highlight w:val="lightGray"/>
+        </w:rPr>
+        <w:t>o</w:t>
+      </w:r>
+      <w:r>
+        <w:rPr>
+          <w:rFonts w:ascii="Arial" w:hAnsi="Arial" w:eastAsia="Arial" w:cs="Arial"/>
+          <w:b w:val="0"/>
+          <w:i w:val="0"/>
+          <w:color w:val="000000"/>
+          <w:sz w:val="18"/>
+          <w:highlight w:val="lightGray"/>
+        </w:rPr>
+        <w:t>n</w:t>
+      </w:r>
+      <w:r>
+        <w:rPr>
+          <w:rFonts w:ascii="Arial" w:hAnsi="Arial" w:eastAsia="Arial" w:cs="Arial"/>
+          <w:b w:val="0"/>
+          <w:i w:val="0"/>
+          <w:color w:val="000000"/>
+          <w:sz w:val="18"/>
+          <w:highlight w:val="lightGray"/>
+        </w:rPr>
+        <w:t>s</w:t>
+      </w:r>
+      <w:r>
+        <w:rPr>
+          <w:rFonts w:ascii="Arial" w:hAnsi="Arial" w:eastAsia="Arial" w:cs="Arial"/>
+          <w:b w:val="0"/>
+          <w:i w:val="0"/>
+          <w:color w:val="000000"/>
+          <w:sz w:val="18"/>
+          <w:highlight w:val="lightGray"/>
+        </w:rPr>
+        <w:t xml:space="preserve"> </w:t>
+      </w:r>
+      <w:r>
+        <w:rPr>
+          <w:rFonts w:ascii="Arial" w:hAnsi="Arial" w:eastAsia="Arial" w:cs="Arial"/>
+          <w:b w:val="0"/>
+          <w:i w:val="0"/>
+          <w:color w:val="000000"/>
+          <w:sz w:val="18"/>
+          <w:highlight w:val="lightGray"/>
+        </w:rPr>
+        <w:t>T</w:t>
+      </w:r>
+      <w:r>
+        <w:rPr>
+          <w:rFonts w:ascii="Arial" w:hAnsi="Arial" w:eastAsia="Arial" w:cs="Arial"/>
+          <w:b w:val="0"/>
+          <w:i w:val="0"/>
+          <w:color w:val="000000"/>
+          <w:sz w:val="18"/>
+          <w:highlight w:val="lightGray"/>
+        </w:rPr>
+        <w:t>a</w:t>
+      </w:r>
+      <w:r>
+        <w:rPr>
+          <w:rFonts w:ascii="Arial" w:hAnsi="Arial" w:eastAsia="Arial" w:cs="Arial"/>
+          <w:b w:val="0"/>
+          <w:i w:val="0"/>
+          <w:color w:val="000000"/>
+          <w:sz w:val="18"/>
+          <w:highlight w:val="lightGray"/>
+        </w:rPr>
+        <w:t>b</w:t>
+      </w:r>
+      <w:r>
+        <w:rPr>
+          <w:rFonts w:ascii="Arial" w:hAnsi="Arial" w:eastAsia="Arial" w:cs="Arial"/>
+          <w:b w:val="0"/>
+          <w:i w:val="0"/>
+          <w:color w:val="000000"/>
+          <w:sz w:val="18"/>
+          <w:highlight w:val="lightGray"/>
+        </w:rPr>
+        <w:t>l</w:t>
+      </w:r>
+      <w:r>
+        <w:rPr>
+          <w:rFonts w:ascii="Arial" w:hAnsi="Arial" w:eastAsia="Arial" w:cs="Arial"/>
+          <w:b w:val="0"/>
+          <w:i w:val="0"/>
+          <w:color w:val="000000"/>
+          <w:sz w:val="18"/>
+          <w:highlight w:val="lightGray"/>
+        </w:rPr>
+        <w:t>e</w:t>
+      </w:r>
+      <w:r>
+        <w:rPr>
+          <w:rFonts w:ascii="Arial" w:hAnsi="Arial" w:eastAsia="Arial" w:cs="Arial"/>
+          <w:b w:val="0"/>
+          <w:i w:val="0"/>
+          <w:color w:val="000000"/>
+          <w:sz w:val="18"/>
+          <w:highlight w:val="lightGray"/>
+        </w:rPr>
+        <w:t xml:space="preserve"> </w:t>
+      </w:r>
+      <w:r>
+        <w:rPr>
+          <w:rFonts w:ascii="Arial" w:hAnsi="Arial" w:eastAsia="Arial" w:cs="Arial"/>
+          <w:b w:val="0"/>
+          <w:i w:val="0"/>
+          <w:color w:val="000000"/>
+          <w:sz w:val="18"/>
+          <w:highlight w:val="lightGray"/>
+        </w:rPr>
+        <w:t>-</w:t>
+      </w:r>
+      <w:r>
+        <w:rPr>
+          <w:rFonts w:ascii="Arial" w:hAnsi="Arial" w:eastAsia="Arial" w:cs="Arial"/>
+          <w:b w:val="0"/>
+          <w:i w:val="0"/>
+          <w:color w:val="000000"/>
+          <w:sz w:val="18"/>
+          <w:highlight w:val="lightGray"/>
+        </w:rPr>
+        <w:t>&gt;</w:t>
+      </w:r>
+      <w:r>
+        <w:rPr>
+          <w:rFonts w:ascii="Arial" w:hAnsi="Arial" w:eastAsia="Arial" w:cs="Arial"/>
+          <w:b w:val="0"/>
+          <w:i w:val="0"/>
+          <w:color w:val="000000"/>
+          <w:sz w:val="18"/>
+          <w:highlight w:val="lightGray"/>
+        </w:rPr>
+        <w:t xml:space="preserve"> </w:t>
+      </w:r>
+      <w:r>
+        <w:rPr>
+          <w:rFonts w:ascii="Arial" w:hAnsi="Arial" w:eastAsia="Arial" w:cs="Arial"/>
+          <w:b w:val="0"/>
+          <w:i w:val="0"/>
+          <w:color w:val="000000"/>
+          <w:sz w:val="18"/>
+          <w:highlight w:val="lightGray"/>
+        </w:rPr>
+        <w:t>I</w:t>
+      </w:r>
+      <w:r>
+        <w:rPr>
+          <w:rFonts w:ascii="Arial" w:hAnsi="Arial" w:eastAsia="Arial" w:cs="Arial"/>
+          <w:b w:val="0"/>
+          <w:i w:val="0"/>
+          <w:color w:val="000000"/>
+          <w:sz w:val="18"/>
+          <w:highlight w:val="lightGray"/>
+        </w:rPr>
+        <w:t>D</w:t>
+      </w:r>
+      <w:r>
+        <w:rPr>
+          <w:rFonts w:ascii="Arial" w:hAnsi="Arial" w:eastAsia="Arial" w:cs="Arial"/>
+          <w:b w:val="0"/>
+          <w:i w:val="0"/>
+          <w:color w:val="000000"/>
+          <w:sz w:val="18"/>
+          <w:highlight w:val="lightGray"/>
+        </w:rPr>
+        <w:t xml:space="preserve"> </w:t>
+      </w:r>
+      <w:r>
+        <w:rPr>
+          <w:rFonts w:ascii="Arial" w:hAnsi="Arial" w:eastAsia="Arial" w:cs="Arial"/>
+          <w:b w:val="0"/>
+          <w:i w:val="0"/>
+          <w:color w:val="000000"/>
+          <w:sz w:val="18"/>
+          <w:highlight w:val="lightGray"/>
+        </w:rPr>
+        <w:t>C</w:t>
+      </w:r>
+      <w:r>
+        <w:rPr>
+          <w:rFonts w:ascii="Arial" w:hAnsi="Arial" w:eastAsia="Arial" w:cs="Arial"/>
+          <w:b w:val="0"/>
+          <w:i w:val="0"/>
+          <w:color w:val="000000"/>
+          <w:sz w:val="18"/>
+          <w:highlight w:val="lightGray"/>
+        </w:rPr>
+        <w:t>o</w:t>
+      </w:r>
+      <w:r>
+        <w:rPr>
+          <w:rFonts w:ascii="Arial" w:hAnsi="Arial" w:eastAsia="Arial" w:cs="Arial"/>
+          <w:b w:val="0"/>
+          <w:i w:val="0"/>
+          <w:color w:val="000000"/>
+          <w:sz w:val="18"/>
+          <w:highlight w:val="lightGray"/>
+        </w:rPr>
+        <w:t>l</w:t>
+      </w:r>
+      <w:r>
+        <w:rPr>
+          <w:rFonts w:ascii="Arial" w:hAnsi="Arial" w:eastAsia="Arial" w:cs="Arial"/>
+          <w:b w:val="0"/>
+          <w:i w:val="0"/>
+          <w:color w:val="000000"/>
+          <w:sz w:val="18"/>
+          <w:highlight w:val="lightGray"/>
+        </w:rPr>
+        <w:t>u</w:t>
+      </w:r>
+      <w:r>
+        <w:rPr>
+          <w:rFonts w:ascii="Arial" w:hAnsi="Arial" w:eastAsia="Arial" w:cs="Arial"/>
+          <w:b w:val="0"/>
+          <w:i w:val="0"/>
+          <w:color w:val="000000"/>
+          <w:sz w:val="18"/>
+          <w:highlight w:val="lightGray"/>
+        </w:rPr>
+        <w:t>m</w:t>
+      </w:r>
+      <w:r>
+        <w:rPr>
+          <w:rFonts w:ascii="Arial" w:hAnsi="Arial" w:eastAsia="Arial" w:cs="Arial"/>
+          <w:b w:val="0"/>
+          <w:i w:val="0"/>
+          <w:color w:val="000000"/>
+          <w:sz w:val="18"/>
+          <w:highlight w:val="lightGray"/>
+        </w:rPr>
+        <w:t>n</w:t>
+      </w:r>
+      <w:r>
+        <w:rPr>
+          <w:rFonts w:ascii="Arial" w:hAnsi="Arial" w:eastAsia="Arial" w:cs="Arial"/>
+          <w:b w:val="0"/>
+          <w:i w:val="0"/>
+          <w:color w:val="000000"/>
+          <w:sz w:val="18"/>
+          <w:highlight w:val="lightGray"/>
+        </w:rPr>
+        <w:t>:</w:t>
+      </w:r>
+      <w:r>
+        <w:rPr>
+          <w:rFonts w:ascii="Arial" w:hAnsi="Arial" w:eastAsia="Arial" w:cs="Arial"/>
+          <w:b w:val="0"/>
+          <w:i w:val="0"/>
+          <w:color w:val="000000"/>
+          <w:sz w:val="18"/>
+          <w:highlight w:val="lightGray"/>
+        </w:rPr>
+        <w:t xml:space="preserve"> </w:t>
+      </w:r>
+      <w:r>
+        <w:rPr>
+          <w:rFonts w:ascii="Arial" w:hAnsi="Arial" w:eastAsia="Arial" w:cs="Arial"/>
+          <w:b w:val="0"/>
+          <w:i w:val="0"/>
+          <w:color w:val="000000"/>
+          <w:sz w:val="18"/>
+          <w:highlight w:val="lightGray"/>
+        </w:rPr>
+        <w:t>1</w:t>
+      </w:r>
+      <w:r>
+        <w:rPr>
+          <w:rFonts w:ascii="Arial" w:hAnsi="Arial" w:eastAsia="Arial" w:cs="Arial"/>
+          <w:b w:val="0"/>
+          <w:i w:val="0"/>
+          <w:color w:val="000000"/>
+          <w:sz w:val="18"/>
+          <w:highlight w:val="lightGray"/>
+        </w:rPr>
+        <w:t>,</w:t>
+      </w:r>
+      <w:r>
+        <w:rPr>
+          <w:rFonts w:ascii="Arial" w:hAnsi="Arial" w:eastAsia="Arial" w:cs="Arial"/>
+          <w:b w:val="0"/>
+          <w:i w:val="0"/>
+          <w:color w:val="000000"/>
+          <w:sz w:val="18"/>
+          <w:highlight w:val="lightGray"/>
+        </w:rPr>
+        <w:t xml:space="preserve"> </w:t>
+      </w:r>
+      <w:r>
+        <w:rPr>
+          <w:rFonts w:ascii="Arial" w:hAnsi="Arial" w:eastAsia="Arial" w:cs="Arial"/>
+          <w:b w:val="0"/>
+          <w:i w:val="0"/>
+          <w:color w:val="000000"/>
+          <w:sz w:val="18"/>
+          <w:highlight w:val="lightGray"/>
+        </w:rPr>
+        <w:t>N</w:t>
+      </w:r>
+      <w:r>
+        <w:rPr>
+          <w:rFonts w:ascii="Arial" w:hAnsi="Arial" w:eastAsia="Arial" w:cs="Arial"/>
+          <w:b w:val="0"/>
+          <w:i w:val="0"/>
+          <w:color w:val="000000"/>
+          <w:sz w:val="18"/>
+          <w:highlight w:val="lightGray"/>
+        </w:rPr>
+        <w:t>a</w:t>
+      </w:r>
+      <w:r>
+        <w:rPr>
+          <w:rFonts w:ascii="Arial" w:hAnsi="Arial" w:eastAsia="Arial" w:cs="Arial"/>
+          <w:b w:val="0"/>
+          <w:i w:val="0"/>
+          <w:color w:val="000000"/>
+          <w:sz w:val="18"/>
+          <w:highlight w:val="lightGray"/>
+        </w:rPr>
+        <w:t>m</w:t>
+      </w:r>
+      <w:r>
+        <w:rPr>
+          <w:rFonts w:ascii="Arial" w:hAnsi="Arial" w:eastAsia="Arial" w:cs="Arial"/>
+          <w:b w:val="0"/>
+          <w:i w:val="0"/>
+          <w:color w:val="000000"/>
+          <w:sz w:val="18"/>
+          <w:highlight w:val="lightGray"/>
+        </w:rPr>
+        <w:t>e</w:t>
+      </w:r>
+      <w:r>
+        <w:rPr>
+          <w:rFonts w:ascii="Arial" w:hAnsi="Arial" w:eastAsia="Arial" w:cs="Arial"/>
+          <w:b w:val="0"/>
+          <w:i w:val="0"/>
+          <w:color w:val="000000"/>
+          <w:sz w:val="18"/>
+          <w:highlight w:val="lightGray"/>
+        </w:rPr>
+        <w:t>_</w:t>
+      </w:r>
+      <w:r>
+        <w:rPr>
+          <w:rFonts w:ascii="Arial" w:hAnsi="Arial" w:eastAsia="Arial" w:cs="Arial"/>
+          <w:b w:val="0"/>
+          <w:i w:val="0"/>
+          <w:color w:val="000000"/>
+          <w:sz w:val="18"/>
+          <w:highlight w:val="lightGray"/>
+        </w:rPr>
+        <w:t>E</w:t>
+      </w:r>
+      <w:r>
+        <w:rPr>
+          <w:rFonts w:ascii="Arial" w:hAnsi="Arial" w:eastAsia="Arial" w:cs="Arial"/>
+          <w:b w:val="0"/>
+          <w:i w:val="0"/>
+          <w:color w:val="000000"/>
+          <w:sz w:val="18"/>
+          <w:highlight w:val="lightGray"/>
+        </w:rPr>
+        <w:t>n</w:t>
+      </w:r>
+      <w:r>
+        <w:rPr>
+          <w:rFonts w:ascii="Arial" w:hAnsi="Arial" w:eastAsia="Arial" w:cs="Arial"/>
+          <w:b w:val="0"/>
+          <w:i w:val="0"/>
+          <w:color w:val="000000"/>
+          <w:sz w:val="18"/>
+          <w:highlight w:val="lightGray"/>
+        </w:rPr>
+        <w:t xml:space="preserve"> </w:t>
+      </w:r>
+      <w:r>
+        <w:rPr>
+          <w:rFonts w:ascii="Arial" w:hAnsi="Arial" w:eastAsia="Arial" w:cs="Arial"/>
+          <w:b w:val="0"/>
+          <w:i w:val="0"/>
+          <w:color w:val="000000"/>
+          <w:sz w:val="18"/>
+          <w:highlight w:val="lightGray"/>
+        </w:rPr>
+        <w:t>C</w:t>
+      </w:r>
+      <w:r>
+        <w:rPr>
+          <w:rFonts w:ascii="Arial" w:hAnsi="Arial" w:eastAsia="Arial" w:cs="Arial"/>
+          <w:b w:val="0"/>
+          <w:i w:val="0"/>
+          <w:color w:val="000000"/>
+          <w:sz w:val="18"/>
+          <w:highlight w:val="lightGray"/>
+        </w:rPr>
+        <w:t>o</w:t>
+      </w:r>
+      <w:r>
+        <w:rPr>
+          <w:rFonts w:ascii="Arial" w:hAnsi="Arial" w:eastAsia="Arial" w:cs="Arial"/>
+          <w:b w:val="0"/>
+          <w:i w:val="0"/>
+          <w:color w:val="000000"/>
+          <w:sz w:val="18"/>
+          <w:highlight w:val="lightGray"/>
+        </w:rPr>
+        <w:t>l</w:t>
+      </w:r>
+      <w:r>
+        <w:rPr>
+          <w:rFonts w:ascii="Arial" w:hAnsi="Arial" w:eastAsia="Arial" w:cs="Arial"/>
+          <w:b w:val="0"/>
+          <w:i w:val="0"/>
+          <w:color w:val="000000"/>
+          <w:sz w:val="18"/>
+          <w:highlight w:val="lightGray"/>
+        </w:rPr>
+        <w:t>u</w:t>
+      </w:r>
+      <w:r>
+        <w:rPr>
+          <w:rFonts w:ascii="Arial" w:hAnsi="Arial" w:eastAsia="Arial" w:cs="Arial"/>
+          <w:b w:val="0"/>
+          <w:i w:val="0"/>
+          <w:color w:val="000000"/>
+          <w:sz w:val="18"/>
+          <w:highlight w:val="lightGray"/>
+        </w:rPr>
+        <w:t>m</w:t>
+      </w:r>
+      <w:r>
+        <w:rPr>
+          <w:rFonts w:ascii="Arial" w:hAnsi="Arial" w:eastAsia="Arial" w:cs="Arial"/>
+          <w:b w:val="0"/>
+          <w:i w:val="0"/>
+          <w:color w:val="000000"/>
+          <w:sz w:val="18"/>
+          <w:highlight w:val="lightGray"/>
+        </w:rPr>
+        <w:t>n</w:t>
+      </w:r>
+      <w:r>
+        <w:rPr>
+          <w:rFonts w:ascii="Arial" w:hAnsi="Arial" w:eastAsia="Arial" w:cs="Arial"/>
+          <w:b w:val="0"/>
+          <w:i w:val="0"/>
+          <w:color w:val="000000"/>
+          <w:sz w:val="18"/>
+          <w:highlight w:val="lightGray"/>
+        </w:rPr>
+        <w:t>:</w:t>
+      </w:r>
+      <w:r>
+        <w:rPr>
+          <w:rFonts w:ascii="Arial" w:hAnsi="Arial" w:eastAsia="Arial" w:cs="Arial"/>
+          <w:b w:val="0"/>
+          <w:i w:val="0"/>
+          <w:color w:val="000000"/>
+          <w:sz w:val="18"/>
+          <w:highlight w:val="lightGray"/>
+        </w:rPr>
+        <w:t xml:space="preserve"> </w:t>
+      </w:r>
+      <w:r>
+        <w:rPr>
+          <w:rFonts w:ascii="Arial" w:hAnsi="Arial" w:eastAsia="Arial" w:cs="Arial"/>
+          <w:b w:val="0"/>
+          <w:i w:val="0"/>
+          <w:color w:val="000000"/>
+          <w:sz w:val="18"/>
+          <w:highlight w:val="lightGray"/>
+        </w:rPr>
+        <w:t>M</w:t>
+      </w:r>
+      <w:r>
+        <w:rPr>
+          <w:rFonts w:ascii="Arial" w:hAnsi="Arial" w:eastAsia="Arial" w:cs="Arial"/>
+          <w:b w:val="0"/>
+          <w:i w:val="0"/>
+          <w:color w:val="000000"/>
+          <w:sz w:val="18"/>
+          <w:highlight w:val="lightGray"/>
+        </w:rPr>
+        <w:t>o</w:t>
+      </w:r>
+      <w:r>
+        <w:rPr>
+          <w:rFonts w:ascii="Arial" w:hAnsi="Arial" w:eastAsia="Arial" w:cs="Arial"/>
+          <w:b w:val="0"/>
+          <w:i w:val="0"/>
+          <w:color w:val="000000"/>
+          <w:sz w:val="18"/>
+          <w:highlight w:val="lightGray"/>
+        </w:rPr>
+        <w:t>t</w:t>
+      </w:r>
+      <w:r>
+        <w:rPr>
+          <w:rFonts w:ascii="Arial" w:hAnsi="Arial" w:eastAsia="Arial" w:cs="Arial"/>
+          <w:b w:val="0"/>
+          <w:i w:val="0"/>
+          <w:color w:val="000000"/>
+          <w:sz w:val="18"/>
+          <w:highlight w:val="lightGray"/>
+        </w:rPr>
+        <w:t>a</w:t>
+      </w:r>
+      <w:r>
+        <w:rPr>
+          <w:rFonts w:ascii="Arial" w:hAnsi="Arial" w:eastAsia="Arial" w:cs="Arial"/>
+          <w:b w:val="0"/>
+          <w:i w:val="0"/>
+          <w:color w:val="000000"/>
+          <w:sz w:val="18"/>
+          <w:highlight w:val="lightGray"/>
+        </w:rPr>
+        <w:t>s</w:t>
+      </w:r>
+      <w:r>
+        <w:rPr>
+          <w:rFonts w:ascii="Arial" w:hAnsi="Arial" w:eastAsia="Arial" w:cs="Arial"/>
+          <w:b w:val="0"/>
+          <w:i w:val="0"/>
+          <w:color w:val="000000"/>
+          <w:sz w:val="18"/>
+          <w:highlight w:val="lightGray"/>
+        </w:rPr>
+        <w:t>e</w:t>
+      </w:r>
+      <w:r>
+        <w:rPr>
+          <w:rFonts w:ascii="Arial" w:hAnsi="Arial" w:eastAsia="Arial" w:cs="Arial"/>
+          <w:b w:val="0"/>
+          <w:i w:val="0"/>
+          <w:color w:val="000000"/>
+          <w:sz w:val="18"/>
+          <w:highlight w:val="lightGray"/>
+        </w:rPr>
+        <w:t>m</w:t>
+      </w:r>
+      <w:r>
+        <w:rPr>
+          <w:rFonts w:ascii="Arial" w:hAnsi="Arial" w:eastAsia="Arial" w:cs="Arial"/>
+          <w:b w:val="0"/>
+          <w:i w:val="0"/>
+          <w:color w:val="000000"/>
+          <w:sz w:val="18"/>
+          <w:highlight w:val="lightGray"/>
+        </w:rPr>
+        <w:t xml:space="preserve"> </w:t>
+      </w:r>
+      <w:r>
+        <w:rPr>
+          <w:rFonts w:ascii="Arial" w:hAnsi="Arial" w:eastAsia="Arial" w:cs="Arial"/>
+          <w:b w:val="0"/>
+          <w:i w:val="0"/>
+          <w:color w:val="000000"/>
+          <w:sz w:val="18"/>
+          <w:highlight w:val="lightGray"/>
+        </w:rPr>
+        <w:t>E</w:t>
+      </w:r>
+      <w:r>
+        <w:rPr>
+          <w:rFonts w:ascii="Arial" w:hAnsi="Arial" w:eastAsia="Arial" w:cs="Arial"/>
+          <w:b w:val="0"/>
+          <w:i w:val="0"/>
+          <w:color w:val="000000"/>
+          <w:sz w:val="18"/>
+          <w:highlight w:val="lightGray"/>
+        </w:rPr>
+        <w:t>s</w:t>
+      </w:r>
+      <w:r>
+        <w:rPr>
+          <w:rFonts w:ascii="Arial" w:hAnsi="Arial" w:eastAsia="Arial" w:cs="Arial"/>
+          <w:b w:val="0"/>
+          <w:i w:val="0"/>
+          <w:color w:val="000000"/>
+          <w:sz w:val="18"/>
+          <w:highlight w:val="lightGray"/>
+        </w:rPr>
+        <w:t>s</w:t>
+      </w:r>
+      <w:r>
+        <w:rPr>
+          <w:rFonts w:ascii="Arial" w:hAnsi="Arial" w:eastAsia="Arial" w:cs="Arial"/>
+          <w:b w:val="0"/>
+          <w:i w:val="0"/>
+          <w:color w:val="000000"/>
+          <w:sz w:val="18"/>
+          <w:highlight w:val="lightGray"/>
+        </w:rPr>
+        <w:t>a</w:t>
+      </w:r>
+      <w:r>
+        <w:rPr>
+          <w:rFonts w:ascii="Arial" w:hAnsi="Arial" w:eastAsia="Arial" w:cs="Arial"/>
+          <w:b w:val="0"/>
+          <w:i w:val="0"/>
+          <w:color w:val="000000"/>
+          <w:sz w:val="18"/>
+          <w:highlight w:val="lightGray"/>
+        </w:rPr>
+        <w:t>m</w:t>
+      </w:r>
+      <w:r>
+        <w:rPr>
+          <w:rFonts w:ascii="Arial" w:hAnsi="Arial" w:eastAsia="Arial" w:cs="Arial"/>
+          <w:b w:val="0"/>
+          <w:i w:val="0"/>
+          <w:color w:val="000000"/>
+          <w:sz w:val="18"/>
+          <w:highlight w:val="lightGray"/>
+        </w:rPr>
+        <w:t>]</w:t>
+      </w:r>
+      <w:r>
+        <w:rPr>
+          <w:rFonts w:ascii="Arial" w:hAnsi="Arial" w:eastAsia="Arial" w:cs="Arial"/>
+          <w:b w:val="0"/>
+          <w:i w:val="0"/>
+          <w:color w:val="000000"/>
+          <w:sz w:val="18"/>
+          <w:highlight w:val="lightGray"/>
+        </w:rPr>
+        <w:t xml:space="preserve"> </w:t>
+      </w:r>
+      <w:r>
+        <w:rPr>
+          <w:rFonts w:ascii="Arial" w:hAnsi="Arial" w:eastAsia="Arial" w:cs="Arial"/>
+          <w:b w:val="0"/>
+          <w:i w:val="0"/>
+          <w:color w:val="000000"/>
+          <w:sz w:val="18"/>
+          <w:highlight w:val="lightGray"/>
+        </w:rPr>
+        <w:t>-</w:t>
+      </w:r>
+      <w:r>
+        <w:rPr>
+          <w:rFonts w:ascii="Arial" w:hAnsi="Arial" w:eastAsia="Arial" w:cs="Arial"/>
+          <w:b w:val="0"/>
+          <w:i w:val="0"/>
+          <w:color w:val="000000"/>
+          <w:sz w:val="18"/>
+          <w:highlight w:val="lightGray"/>
+        </w:rPr>
+        <w:t>&gt;</w:t>
+      </w:r>
+      <w:r>
+        <w:rPr>
+          <w:rFonts w:ascii="Arial" w:hAnsi="Arial" w:eastAsia="Arial" w:cs="Arial"/>
+          <w:b w:val="0"/>
+          <w:i w:val="0"/>
+          <w:color w:val="000000"/>
+          <w:sz w:val="18"/>
+          <w:highlight w:val="lightGray"/>
+        </w:rPr>
+        <w:t xml:space="preserve"> </w:t>
+      </w:r>
+      <w:r>
+        <w:rPr>
+          <w:rFonts w:ascii="Arial" w:hAnsi="Arial" w:eastAsia="Arial" w:cs="Arial"/>
+          <w:b/>
+          <w:i w:val="0"/>
+          <w:color w:val="000000"/>
+          <w:sz w:val="18"/>
+          <w:highlight w:val="lightGray"/>
+        </w:rPr>
+        <w:t>F</w:t>
+      </w:r>
+      <w:r>
+        <w:rPr>
+          <w:rFonts w:ascii="Arial" w:hAnsi="Arial" w:eastAsia="Arial" w:cs="Arial"/>
+          <w:b/>
+          <w:i w:val="0"/>
+          <w:color w:val="000000"/>
+          <w:sz w:val="18"/>
+          <w:highlight w:val="lightGray"/>
+        </w:rPr>
+        <w:t>r</w:t>
+      </w:r>
+      <w:r>
+        <w:rPr>
+          <w:rFonts w:ascii="Arial" w:hAnsi="Arial" w:eastAsia="Arial" w:cs="Arial"/>
+          <w:b/>
+          <w:i w:val="0"/>
+          <w:color w:val="000000"/>
+          <w:sz w:val="18"/>
+          <w:highlight w:val="lightGray"/>
+        </w:rPr>
+        <w:t>o</w:t>
+      </w:r>
+      <w:r>
+        <w:rPr>
+          <w:rFonts w:ascii="Arial" w:hAnsi="Arial" w:eastAsia="Arial" w:cs="Arial"/>
+          <w:b/>
+          <w:i w:val="0"/>
+          <w:color w:val="000000"/>
+          <w:sz w:val="18"/>
+          <w:highlight w:val="lightGray"/>
+        </w:rPr>
+        <w:t>m</w:t>
+      </w:r>
+      <w:r>
+        <w:rPr>
+          <w:rFonts w:ascii="Arial" w:hAnsi="Arial" w:eastAsia="Arial" w:cs="Arial"/>
+          <w:b/>
+          <w:i w:val="0"/>
+          <w:color w:val="000000"/>
+          <w:sz w:val="18"/>
+          <w:highlight w:val="lightGray"/>
+        </w:rPr>
+        <w:t>:</w:t>
+      </w:r>
+      <w:r>
+        <w:rPr>
+          <w:rFonts w:ascii="Arial" w:hAnsi="Arial" w:eastAsia="Arial" w:cs="Arial"/>
+          <w:b w:val="0"/>
+          <w:i w:val="0"/>
+          <w:color w:val="000000"/>
+          <w:sz w:val="18"/>
+          <w:highlight w:val="lightGray"/>
+        </w:rPr>
+        <w:t xml:space="preserve"> </w:t>
+      </w:r>
+      <w:r>
+        <w:rPr>
+          <w:rFonts w:ascii="Arial" w:hAnsi="Arial" w:eastAsia="Arial" w:cs="Arial"/>
+          <w:b w:val="0"/>
+          <w:i w:val="0"/>
+          <w:color w:val="000000"/>
+          <w:sz w:val="18"/>
+          <w:highlight w:val="lightGray"/>
+        </w:rPr>
+        <w:t>[</w:t>
+      </w:r>
+      <w:r>
+        <w:rPr>
+          <w:rFonts w:ascii="Arial" w:hAnsi="Arial" w:eastAsia="Arial" w:cs="Arial"/>
+          <w:b w:val="0"/>
+          <w:i w:val="0"/>
+          <w:color w:val="000000"/>
+          <w:sz w:val="18"/>
+          <w:highlight w:val="lightGray"/>
+        </w:rPr>
+        <w:t>C</w:t>
+      </w:r>
+      <w:r>
+        <w:rPr>
+          <w:rFonts w:ascii="Arial" w:hAnsi="Arial" w:eastAsia="Arial" w:cs="Arial"/>
+          <w:b w:val="0"/>
+          <w:i w:val="0"/>
+          <w:color w:val="000000"/>
+          <w:sz w:val="18"/>
+          <w:highlight w:val="lightGray"/>
+        </w:rPr>
+        <w:t>h</w:t>
+      </w:r>
+      <w:r>
+        <w:rPr>
+          <w:rFonts w:ascii="Arial" w:hAnsi="Arial" w:eastAsia="Arial" w:cs="Arial"/>
+          <w:b w:val="0"/>
+          <w:i w:val="0"/>
+          <w:color w:val="000000"/>
+          <w:sz w:val="18"/>
+          <w:highlight w:val="lightGray"/>
+        </w:rPr>
+        <w:t>a</w:t>
+      </w:r>
+      <w:r>
+        <w:rPr>
+          <w:rFonts w:ascii="Arial" w:hAnsi="Arial" w:eastAsia="Arial" w:cs="Arial"/>
+          <w:b w:val="0"/>
+          <w:i w:val="0"/>
+          <w:color w:val="000000"/>
+          <w:sz w:val="18"/>
+          <w:highlight w:val="lightGray"/>
+        </w:rPr>
+        <w:t>t</w:t>
+      </w:r>
+      <w:r>
+        <w:rPr>
+          <w:rFonts w:ascii="Arial" w:hAnsi="Arial" w:eastAsia="Arial" w:cs="Arial"/>
+          <w:b w:val="0"/>
+          <w:i w:val="0"/>
+          <w:color w:val="000000"/>
+          <w:sz w:val="18"/>
+          <w:highlight w:val="lightGray"/>
+        </w:rPr>
+        <w:t>G</w:t>
+      </w:r>
+      <w:r>
+        <w:rPr>
+          <w:rFonts w:ascii="Arial" w:hAnsi="Arial" w:eastAsia="Arial" w:cs="Arial"/>
+          <w:b w:val="0"/>
+          <w:i w:val="0"/>
+          <w:color w:val="000000"/>
+          <w:sz w:val="18"/>
+          <w:highlight w:val="lightGray"/>
+        </w:rPr>
+        <w:t>P</w:t>
+      </w:r>
+      <w:r>
+        <w:rPr>
+          <w:rFonts w:ascii="Arial" w:hAnsi="Arial" w:eastAsia="Arial" w:cs="Arial"/>
+          <w:b w:val="0"/>
+          <w:i w:val="0"/>
+          <w:color w:val="000000"/>
+          <w:sz w:val="18"/>
+          <w:highlight w:val="lightGray"/>
+        </w:rPr>
+        <w:t>T</w:t>
+      </w:r>
+      <w:r>
+        <w:rPr>
+          <w:rFonts w:ascii="Arial" w:hAnsi="Arial" w:eastAsia="Arial" w:cs="Arial"/>
+          <w:b w:val="0"/>
+          <w:i w:val="0"/>
+          <w:color w:val="000000"/>
+          <w:sz w:val="18"/>
+          <w:highlight w:val="lightGray"/>
+        </w:rPr>
+        <w:t>]</w:t>
+      </w:r>
+      <w:r>
+        <w:rPr>
+          <w:rFonts w:ascii="Arial" w:hAnsi="Arial" w:eastAsia="Arial" w:cs="Arial"/>
+          <w:b w:val="0"/>
+          <w:i w:val="0"/>
+          <w:color w:val="000000"/>
+          <w:sz w:val="18"/>
+          <w:highlight w:val="lightGray"/>
+        </w:rPr>
+        <w:t xml:space="preserve"> </w:t>
+      </w:r>
+      <w:r>
+        <w:rPr>
+          <w:rFonts w:ascii="Arial" w:hAnsi="Arial" w:eastAsia="Arial" w:cs="Arial"/>
+          <w:b/>
+          <w:i w:val="0"/>
+          <w:color w:val="000000"/>
+          <w:sz w:val="18"/>
+          <w:highlight w:val="lightGray"/>
+        </w:rPr>
+        <w:t>o</w:t>
+      </w:r>
+      <w:r>
+        <w:rPr>
+          <w:rFonts w:ascii="Arial" w:hAnsi="Arial" w:eastAsia="Arial" w:cs="Arial"/>
+          <w:b/>
+          <w:i w:val="0"/>
+          <w:color w:val="000000"/>
+          <w:sz w:val="18"/>
+          <w:highlight w:val="lightGray"/>
+        </w:rPr>
+        <w:t>n</w:t>
+      </w:r>
+      <w:r>
+        <w:rPr>
+          <w:rFonts w:ascii="Arial" w:hAnsi="Arial" w:eastAsia="Arial" w:cs="Arial"/>
+          <w:b/>
+          <w:i w:val="0"/>
+          <w:color w:val="000000"/>
+          <w:sz w:val="18"/>
+          <w:highlight w:val="lightGray"/>
+        </w:rPr>
+        <w:t xml:space="preserve"> </w:t>
+      </w:r>
+      <w:r>
+        <w:rPr>
+          <w:rFonts w:ascii="Arial" w:hAnsi="Arial" w:eastAsia="Arial" w:cs="Arial"/>
+          <w:b w:val="0"/>
+          <w:i w:val="0"/>
+          <w:color w:val="000000"/>
+          <w:sz w:val="18"/>
+          <w:highlight w:val="lightGray"/>
+        </w:rPr>
+        <w:t>[</w:t>
+      </w:r>
+      <w:r>
+        <w:rPr>
+          <w:rFonts w:ascii="Arial" w:hAnsi="Arial" w:eastAsia="Arial" w:cs="Arial"/>
+          <w:b w:val="0"/>
+          <w:i w:val="0"/>
+          <w:color w:val="000000"/>
+          <w:sz w:val="18"/>
+          <w:highlight w:val="lightGray"/>
+        </w:rPr>
+        <w:t>7</w:t>
+      </w:r>
+      <w:r>
+        <w:rPr>
+          <w:rFonts w:ascii="Arial" w:hAnsi="Arial" w:eastAsia="Arial" w:cs="Arial"/>
+          <w:b w:val="0"/>
+          <w:i w:val="0"/>
+          <w:color w:val="000000"/>
+          <w:sz w:val="18"/>
+          <w:highlight w:val="lightGray"/>
+        </w:rPr>
+        <w:t>/</w:t>
+      </w:r>
+      <w:r>
+        <w:rPr>
+          <w:rFonts w:ascii="Arial" w:hAnsi="Arial" w:eastAsia="Arial" w:cs="Arial"/>
+          <w:b w:val="0"/>
+          <w:i w:val="0"/>
+          <w:color w:val="000000"/>
+          <w:sz w:val="18"/>
+          <w:highlight w:val="lightGray"/>
+        </w:rPr>
+        <w:t>2</w:t>
+      </w:r>
+      <w:r>
+        <w:rPr>
+          <w:rFonts w:ascii="Arial" w:hAnsi="Arial" w:eastAsia="Arial" w:cs="Arial"/>
+          <w:b w:val="0"/>
+          <w:i w:val="0"/>
+          <w:color w:val="000000"/>
+          <w:sz w:val="18"/>
+          <w:highlight w:val="lightGray"/>
+        </w:rPr>
+        <w:t>1</w:t>
+      </w:r>
+      <w:r>
+        <w:rPr>
+          <w:rFonts w:ascii="Arial" w:hAnsi="Arial" w:eastAsia="Arial" w:cs="Arial"/>
+          <w:b w:val="0"/>
+          <w:i w:val="0"/>
+          <w:color w:val="000000"/>
+          <w:sz w:val="18"/>
+          <w:highlight w:val="lightGray"/>
+        </w:rPr>
+        <w:t>/</w:t>
+      </w:r>
+      <w:r>
+        <w:rPr>
+          <w:rFonts w:ascii="Arial" w:hAnsi="Arial" w:eastAsia="Arial" w:cs="Arial"/>
+          <w:b w:val="0"/>
+          <w:i w:val="0"/>
+          <w:color w:val="000000"/>
+          <w:sz w:val="18"/>
+          <w:highlight w:val="lightGray"/>
+        </w:rPr>
+        <w:t>2</w:t>
+      </w:r>
+      <w:r>
+        <w:rPr>
+          <w:rFonts w:ascii="Arial" w:hAnsi="Arial" w:eastAsia="Arial" w:cs="Arial"/>
+          <w:b w:val="0"/>
+          <w:i w:val="0"/>
+          <w:color w:val="000000"/>
+          <w:sz w:val="18"/>
+          <w:highlight w:val="lightGray"/>
+        </w:rPr>
+        <w:t>0</w:t>
+      </w:r>
+      <w:r>
+        <w:rPr>
+          <w:rFonts w:ascii="Arial" w:hAnsi="Arial" w:eastAsia="Arial" w:cs="Arial"/>
+          <w:b w:val="0"/>
+          <w:i w:val="0"/>
+          <w:color w:val="000000"/>
+          <w:sz w:val="18"/>
+          <w:highlight w:val="lightGray"/>
+        </w:rPr>
+        <w:t>2</w:t>
+      </w:r>
+      <w:r>
+        <w:rPr>
+          <w:rFonts w:ascii="Arial" w:hAnsi="Arial" w:eastAsia="Arial" w:cs="Arial"/>
+          <w:b w:val="0"/>
+          <w:i w:val="0"/>
+          <w:color w:val="000000"/>
+          <w:sz w:val="18"/>
+          <w:highlight w:val="lightGray"/>
+        </w:rPr>
+        <w:t>5</w:t>
+      </w:r>
+      <w:r>
+        <w:rPr>
+          <w:rFonts w:ascii="Arial" w:hAnsi="Arial" w:eastAsia="Arial" w:cs="Arial"/>
+          <w:b w:val="0"/>
+          <w:i w:val="0"/>
+          <w:color w:val="000000"/>
+          <w:sz w:val="18"/>
+          <w:highlight w:val="lightGray"/>
+        </w:rPr>
+        <w:t>]</w:t>
       </w:r>
     </w:p>
     <w:p>
@@ -6734,60 +9722,1554 @@
       </w:pPr>
       <w:r>
         <w:rPr>
-          <w:rFonts w:ascii="Arial" w:eastAsia="Arial" w:hAnsi="Arial"/>
-          <w:b/>
-          <w:color w:val="000000"/>
-          <w:sz w:val="18"/>
-          <w:highlight w:val="lightGray"/>
-        </w:rPr>
-        <w:t># Source: AI Source: Provided by: [Data Path</w:t>
-      </w:r>
-      <w:r>
-        <w:rPr>
-          <w:rFonts w:ascii="Arial" w:eastAsia="Arial" w:hAnsi="Arial"/>
-          <w:color w:val="000000"/>
-          <w:sz w:val="18"/>
-          <w:highlight w:val="lightGray"/>
-        </w:rPr>
-        <w:t xml:space="preserve">: Persons Table -&gt; ID Column: 1, Name_En Column: Motasem Essam] -&gt; </w:t>
-      </w:r>
-      <w:r>
-        <w:rPr>
-          <w:rFonts w:ascii="Arial" w:eastAsia="Arial" w:hAnsi="Arial"/>
-          <w:b/>
-          <w:color w:val="000000"/>
-          <w:sz w:val="18"/>
-          <w:highlight w:val="lightGray"/>
-        </w:rPr>
-        <w:t>From:</w:t>
-      </w:r>
-      <w:r>
-        <w:rPr>
-          <w:rFonts w:ascii="Arial" w:eastAsia="Arial" w:hAnsi="Arial"/>
-          <w:color w:val="000000"/>
-          <w:sz w:val="18"/>
-          <w:highlight w:val="lightGray"/>
-        </w:rPr>
-        <w:t xml:space="preserve"> [Chatgpt (GPT-4-turbo)] </w:t>
-      </w:r>
-      <w:r>
-        <w:rPr>
-          <w:rFonts w:ascii="Arial" w:eastAsia="Arial" w:hAnsi="Arial"/>
-          <w:b/>
-          <w:color w:val="000000"/>
-          <w:sz w:val="18"/>
-          <w:highlight w:val="lightGray"/>
-        </w:rPr>
-        <w:t xml:space="preserve">on </w:t>
-      </w:r>
-      <w:r>
-        <w:rPr>
-          <w:rFonts w:ascii="Arial" w:eastAsia="Arial" w:hAnsi="Arial"/>
-          <w:color w:val="000000"/>
-          <w:sz w:val="18"/>
-          <w:highlight w:val="lightGray"/>
-        </w:rPr>
-        <w:t>[7/21/2025]</w:t>
+          <w:rFonts w:ascii="Arial" w:hAnsi="Arial" w:eastAsia="Arial" w:cs="Arial"/>
+          <w:b/>
+          <w:i w:val="0"/>
+          <w:color w:val="000000"/>
+          <w:sz w:val="18"/>
+          <w:highlight w:val="lightGray"/>
+        </w:rPr>
+        <w:t>#</w:t>
+      </w:r>
+      <w:r>
+        <w:rPr>
+          <w:rFonts w:ascii="Arial" w:hAnsi="Arial" w:eastAsia="Arial" w:cs="Arial"/>
+          <w:b/>
+          <w:i w:val="0"/>
+          <w:color w:val="000000"/>
+          <w:sz w:val="18"/>
+          <w:highlight w:val="lightGray"/>
+        </w:rPr>
+        <w:t xml:space="preserve"> </w:t>
+      </w:r>
+      <w:r>
+        <w:rPr>
+          <w:rFonts w:ascii="Arial" w:hAnsi="Arial" w:eastAsia="Arial" w:cs="Arial"/>
+          <w:b/>
+          <w:i w:val="0"/>
+          <w:color w:val="000000"/>
+          <w:sz w:val="18"/>
+          <w:highlight w:val="lightGray"/>
+        </w:rPr>
+        <w:t>S</w:t>
+      </w:r>
+      <w:r>
+        <w:rPr>
+          <w:rFonts w:ascii="Arial" w:hAnsi="Arial" w:eastAsia="Arial" w:cs="Arial"/>
+          <w:b/>
+          <w:i w:val="0"/>
+          <w:color w:val="000000"/>
+          <w:sz w:val="18"/>
+          <w:highlight w:val="lightGray"/>
+        </w:rPr>
+        <w:t>o</w:t>
+      </w:r>
+      <w:r>
+        <w:rPr>
+          <w:rFonts w:ascii="Arial" w:hAnsi="Arial" w:eastAsia="Arial" w:cs="Arial"/>
+          <w:b/>
+          <w:i w:val="0"/>
+          <w:color w:val="000000"/>
+          <w:sz w:val="18"/>
+          <w:highlight w:val="lightGray"/>
+        </w:rPr>
+        <w:t>u</w:t>
+      </w:r>
+      <w:r>
+        <w:rPr>
+          <w:rFonts w:ascii="Arial" w:hAnsi="Arial" w:eastAsia="Arial" w:cs="Arial"/>
+          <w:b/>
+          <w:i w:val="0"/>
+          <w:color w:val="000000"/>
+          <w:sz w:val="18"/>
+          <w:highlight w:val="lightGray"/>
+        </w:rPr>
+        <w:t>r</w:t>
+      </w:r>
+      <w:r>
+        <w:rPr>
+          <w:rFonts w:ascii="Arial" w:hAnsi="Arial" w:eastAsia="Arial" w:cs="Arial"/>
+          <w:b/>
+          <w:i w:val="0"/>
+          <w:color w:val="000000"/>
+          <w:sz w:val="18"/>
+          <w:highlight w:val="lightGray"/>
+        </w:rPr>
+        <w:t>c</w:t>
+      </w:r>
+      <w:r>
+        <w:rPr>
+          <w:rFonts w:ascii="Arial" w:hAnsi="Arial" w:eastAsia="Arial" w:cs="Arial"/>
+          <w:b/>
+          <w:i w:val="0"/>
+          <w:color w:val="000000"/>
+          <w:sz w:val="18"/>
+          <w:highlight w:val="lightGray"/>
+        </w:rPr>
+        <w:t>e</w:t>
+      </w:r>
+      <w:r>
+        <w:rPr>
+          <w:rFonts w:ascii="Arial" w:hAnsi="Arial" w:eastAsia="Arial" w:cs="Arial"/>
+          <w:b/>
+          <w:i w:val="0"/>
+          <w:color w:val="000000"/>
+          <w:sz w:val="18"/>
+          <w:highlight w:val="lightGray"/>
+        </w:rPr>
+        <w:t>:</w:t>
+      </w:r>
+      <w:r>
+        <w:rPr>
+          <w:rFonts w:ascii="Arial" w:hAnsi="Arial" w:eastAsia="Arial" w:cs="Arial"/>
+          <w:b/>
+          <w:i w:val="0"/>
+          <w:color w:val="000000"/>
+          <w:sz w:val="18"/>
+          <w:highlight w:val="lightGray"/>
+        </w:rPr>
+        <w:t xml:space="preserve"> </w:t>
+      </w:r>
+      <w:r>
+        <w:rPr>
+          <w:rFonts w:ascii="Arial" w:hAnsi="Arial" w:eastAsia="Arial" w:cs="Arial"/>
+          <w:b/>
+          <w:i w:val="0"/>
+          <w:color w:val="000000"/>
+          <w:sz w:val="18"/>
+          <w:highlight w:val="lightGray"/>
+        </w:rPr>
+        <w:t>A</w:t>
+      </w:r>
+      <w:r>
+        <w:rPr>
+          <w:rFonts w:ascii="Arial" w:hAnsi="Arial" w:eastAsia="Arial" w:cs="Arial"/>
+          <w:b/>
+          <w:i w:val="0"/>
+          <w:color w:val="000000"/>
+          <w:sz w:val="18"/>
+          <w:highlight w:val="lightGray"/>
+        </w:rPr>
+        <w:t>I</w:t>
+      </w:r>
+      <w:r>
+        <w:rPr>
+          <w:rFonts w:ascii="Arial" w:hAnsi="Arial" w:eastAsia="Arial" w:cs="Arial"/>
+          <w:b/>
+          <w:i w:val="0"/>
+          <w:color w:val="000000"/>
+          <w:sz w:val="18"/>
+          <w:highlight w:val="lightGray"/>
+        </w:rPr>
+        <w:t xml:space="preserve"> </w:t>
+      </w:r>
+      <w:r>
+        <w:rPr>
+          <w:rFonts w:ascii="Arial" w:hAnsi="Arial" w:eastAsia="Arial" w:cs="Arial"/>
+          <w:b/>
+          <w:i w:val="0"/>
+          <w:color w:val="000000"/>
+          <w:sz w:val="18"/>
+          <w:highlight w:val="lightGray"/>
+        </w:rPr>
+        <w:t>S</w:t>
+      </w:r>
+      <w:r>
+        <w:rPr>
+          <w:rFonts w:ascii="Arial" w:hAnsi="Arial" w:eastAsia="Arial" w:cs="Arial"/>
+          <w:b/>
+          <w:i w:val="0"/>
+          <w:color w:val="000000"/>
+          <w:sz w:val="18"/>
+          <w:highlight w:val="lightGray"/>
+        </w:rPr>
+        <w:t>o</w:t>
+      </w:r>
+      <w:r>
+        <w:rPr>
+          <w:rFonts w:ascii="Arial" w:hAnsi="Arial" w:eastAsia="Arial" w:cs="Arial"/>
+          <w:b/>
+          <w:i w:val="0"/>
+          <w:color w:val="000000"/>
+          <w:sz w:val="18"/>
+          <w:highlight w:val="lightGray"/>
+        </w:rPr>
+        <w:t>u</w:t>
+      </w:r>
+      <w:r>
+        <w:rPr>
+          <w:rFonts w:ascii="Arial" w:hAnsi="Arial" w:eastAsia="Arial" w:cs="Arial"/>
+          <w:b/>
+          <w:i w:val="0"/>
+          <w:color w:val="000000"/>
+          <w:sz w:val="18"/>
+          <w:highlight w:val="lightGray"/>
+        </w:rPr>
+        <w:t>r</w:t>
+      </w:r>
+      <w:r>
+        <w:rPr>
+          <w:rFonts w:ascii="Arial" w:hAnsi="Arial" w:eastAsia="Arial" w:cs="Arial"/>
+          <w:b/>
+          <w:i w:val="0"/>
+          <w:color w:val="000000"/>
+          <w:sz w:val="18"/>
+          <w:highlight w:val="lightGray"/>
+        </w:rPr>
+        <w:t>c</w:t>
+      </w:r>
+      <w:r>
+        <w:rPr>
+          <w:rFonts w:ascii="Arial" w:hAnsi="Arial" w:eastAsia="Arial" w:cs="Arial"/>
+          <w:b/>
+          <w:i w:val="0"/>
+          <w:color w:val="000000"/>
+          <w:sz w:val="18"/>
+          <w:highlight w:val="lightGray"/>
+        </w:rPr>
+        <w:t>e</w:t>
+      </w:r>
+      <w:r>
+        <w:rPr>
+          <w:rFonts w:ascii="Arial" w:hAnsi="Arial" w:eastAsia="Arial" w:cs="Arial"/>
+          <w:b/>
+          <w:i w:val="0"/>
+          <w:color w:val="000000"/>
+          <w:sz w:val="18"/>
+          <w:highlight w:val="lightGray"/>
+        </w:rPr>
+        <w:t>:</w:t>
+      </w:r>
+      <w:r>
+        <w:rPr>
+          <w:rFonts w:ascii="Arial" w:hAnsi="Arial" w:eastAsia="Arial" w:cs="Arial"/>
+          <w:b/>
+          <w:i w:val="0"/>
+          <w:color w:val="000000"/>
+          <w:sz w:val="18"/>
+          <w:highlight w:val="lightGray"/>
+        </w:rPr>
+        <w:t xml:space="preserve"> </w:t>
+      </w:r>
+      <w:r>
+        <w:rPr>
+          <w:rFonts w:ascii="Arial" w:hAnsi="Arial" w:eastAsia="Arial" w:cs="Arial"/>
+          <w:b/>
+          <w:i w:val="0"/>
+          <w:color w:val="000000"/>
+          <w:sz w:val="18"/>
+          <w:highlight w:val="lightGray"/>
+        </w:rPr>
+        <w:t>P</w:t>
+      </w:r>
+      <w:r>
+        <w:rPr>
+          <w:rFonts w:ascii="Arial" w:hAnsi="Arial" w:eastAsia="Arial" w:cs="Arial"/>
+          <w:b/>
+          <w:i w:val="0"/>
+          <w:color w:val="000000"/>
+          <w:sz w:val="18"/>
+          <w:highlight w:val="lightGray"/>
+        </w:rPr>
+        <w:t>r</w:t>
+      </w:r>
+      <w:r>
+        <w:rPr>
+          <w:rFonts w:ascii="Arial" w:hAnsi="Arial" w:eastAsia="Arial" w:cs="Arial"/>
+          <w:b/>
+          <w:i w:val="0"/>
+          <w:color w:val="000000"/>
+          <w:sz w:val="18"/>
+          <w:highlight w:val="lightGray"/>
+        </w:rPr>
+        <w:t>o</w:t>
+      </w:r>
+      <w:r>
+        <w:rPr>
+          <w:rFonts w:ascii="Arial" w:hAnsi="Arial" w:eastAsia="Arial" w:cs="Arial"/>
+          <w:b/>
+          <w:i w:val="0"/>
+          <w:color w:val="000000"/>
+          <w:sz w:val="18"/>
+          <w:highlight w:val="lightGray"/>
+        </w:rPr>
+        <w:t>v</w:t>
+      </w:r>
+      <w:r>
+        <w:rPr>
+          <w:rFonts w:ascii="Arial" w:hAnsi="Arial" w:eastAsia="Arial" w:cs="Arial"/>
+          <w:b/>
+          <w:i w:val="0"/>
+          <w:color w:val="000000"/>
+          <w:sz w:val="18"/>
+          <w:highlight w:val="lightGray"/>
+        </w:rPr>
+        <w:t>i</w:t>
+      </w:r>
+      <w:r>
+        <w:rPr>
+          <w:rFonts w:ascii="Arial" w:hAnsi="Arial" w:eastAsia="Arial" w:cs="Arial"/>
+          <w:b/>
+          <w:i w:val="0"/>
+          <w:color w:val="000000"/>
+          <w:sz w:val="18"/>
+          <w:highlight w:val="lightGray"/>
+        </w:rPr>
+        <w:t>d</w:t>
+      </w:r>
+      <w:r>
+        <w:rPr>
+          <w:rFonts w:ascii="Arial" w:hAnsi="Arial" w:eastAsia="Arial" w:cs="Arial"/>
+          <w:b/>
+          <w:i w:val="0"/>
+          <w:color w:val="000000"/>
+          <w:sz w:val="18"/>
+          <w:highlight w:val="lightGray"/>
+        </w:rPr>
+        <w:t>e</w:t>
+      </w:r>
+      <w:r>
+        <w:rPr>
+          <w:rFonts w:ascii="Arial" w:hAnsi="Arial" w:eastAsia="Arial" w:cs="Arial"/>
+          <w:b/>
+          <w:i w:val="0"/>
+          <w:color w:val="000000"/>
+          <w:sz w:val="18"/>
+          <w:highlight w:val="lightGray"/>
+        </w:rPr>
+        <w:t>d</w:t>
+      </w:r>
+      <w:r>
+        <w:rPr>
+          <w:rFonts w:ascii="Arial" w:hAnsi="Arial" w:eastAsia="Arial" w:cs="Arial"/>
+          <w:b/>
+          <w:i w:val="0"/>
+          <w:color w:val="000000"/>
+          <w:sz w:val="18"/>
+          <w:highlight w:val="lightGray"/>
+        </w:rPr>
+        <w:t xml:space="preserve"> </w:t>
+      </w:r>
+      <w:r>
+        <w:rPr>
+          <w:rFonts w:ascii="Arial" w:hAnsi="Arial" w:eastAsia="Arial" w:cs="Arial"/>
+          <w:b/>
+          <w:i w:val="0"/>
+          <w:color w:val="000000"/>
+          <w:sz w:val="18"/>
+          <w:highlight w:val="lightGray"/>
+        </w:rPr>
+        <w:t>b</w:t>
+      </w:r>
+      <w:r>
+        <w:rPr>
+          <w:rFonts w:ascii="Arial" w:hAnsi="Arial" w:eastAsia="Arial" w:cs="Arial"/>
+          <w:b/>
+          <w:i w:val="0"/>
+          <w:color w:val="000000"/>
+          <w:sz w:val="18"/>
+          <w:highlight w:val="lightGray"/>
+        </w:rPr>
+        <w:t>y</w:t>
+      </w:r>
+      <w:r>
+        <w:rPr>
+          <w:rFonts w:ascii="Arial" w:hAnsi="Arial" w:eastAsia="Arial" w:cs="Arial"/>
+          <w:b/>
+          <w:i w:val="0"/>
+          <w:color w:val="000000"/>
+          <w:sz w:val="18"/>
+          <w:highlight w:val="lightGray"/>
+        </w:rPr>
+        <w:t>:</w:t>
+      </w:r>
+      <w:r>
+        <w:rPr>
+          <w:rFonts w:ascii="Arial" w:hAnsi="Arial" w:eastAsia="Arial" w:cs="Arial"/>
+          <w:b/>
+          <w:i w:val="0"/>
+          <w:color w:val="000000"/>
+          <w:sz w:val="18"/>
+          <w:highlight w:val="lightGray"/>
+        </w:rPr>
+        <w:t xml:space="preserve"> </w:t>
+      </w:r>
+      <w:r>
+        <w:rPr>
+          <w:rFonts w:ascii="Arial" w:hAnsi="Arial" w:eastAsia="Arial" w:cs="Arial"/>
+          <w:b/>
+          <w:i w:val="0"/>
+          <w:color w:val="000000"/>
+          <w:sz w:val="18"/>
+          <w:highlight w:val="lightGray"/>
+        </w:rPr>
+        <w:t>[</w:t>
+      </w:r>
+      <w:r>
+        <w:rPr>
+          <w:rFonts w:ascii="Arial" w:hAnsi="Arial" w:eastAsia="Arial" w:cs="Arial"/>
+          <w:b/>
+          <w:i w:val="0"/>
+          <w:color w:val="000000"/>
+          <w:sz w:val="18"/>
+          <w:highlight w:val="lightGray"/>
+        </w:rPr>
+        <w:t>D</w:t>
+      </w:r>
+      <w:r>
+        <w:rPr>
+          <w:rFonts w:ascii="Arial" w:hAnsi="Arial" w:eastAsia="Arial" w:cs="Arial"/>
+          <w:b/>
+          <w:i w:val="0"/>
+          <w:color w:val="000000"/>
+          <w:sz w:val="18"/>
+          <w:highlight w:val="lightGray"/>
+        </w:rPr>
+        <w:t>a</w:t>
+      </w:r>
+      <w:r>
+        <w:rPr>
+          <w:rFonts w:ascii="Arial" w:hAnsi="Arial" w:eastAsia="Arial" w:cs="Arial"/>
+          <w:b/>
+          <w:i w:val="0"/>
+          <w:color w:val="000000"/>
+          <w:sz w:val="18"/>
+          <w:highlight w:val="lightGray"/>
+        </w:rPr>
+        <w:t>t</w:t>
+      </w:r>
+      <w:r>
+        <w:rPr>
+          <w:rFonts w:ascii="Arial" w:hAnsi="Arial" w:eastAsia="Arial" w:cs="Arial"/>
+          <w:b/>
+          <w:i w:val="0"/>
+          <w:color w:val="000000"/>
+          <w:sz w:val="18"/>
+          <w:highlight w:val="lightGray"/>
+        </w:rPr>
+        <w:t>a</w:t>
+      </w:r>
+      <w:r>
+        <w:rPr>
+          <w:rFonts w:ascii="Arial" w:hAnsi="Arial" w:eastAsia="Arial" w:cs="Arial"/>
+          <w:b/>
+          <w:i w:val="0"/>
+          <w:color w:val="000000"/>
+          <w:sz w:val="18"/>
+          <w:highlight w:val="lightGray"/>
+        </w:rPr>
+        <w:t xml:space="preserve"> </w:t>
+      </w:r>
+      <w:r>
+        <w:rPr>
+          <w:rFonts w:ascii="Arial" w:hAnsi="Arial" w:eastAsia="Arial" w:cs="Arial"/>
+          <w:b/>
+          <w:i w:val="0"/>
+          <w:color w:val="000000"/>
+          <w:sz w:val="18"/>
+          <w:highlight w:val="lightGray"/>
+        </w:rPr>
+        <w:t>P</w:t>
+      </w:r>
+      <w:r>
+        <w:rPr>
+          <w:rFonts w:ascii="Arial" w:hAnsi="Arial" w:eastAsia="Arial" w:cs="Arial"/>
+          <w:b/>
+          <w:i w:val="0"/>
+          <w:color w:val="000000"/>
+          <w:sz w:val="18"/>
+          <w:highlight w:val="lightGray"/>
+        </w:rPr>
+        <w:t>a</w:t>
+      </w:r>
+      <w:r>
+        <w:rPr>
+          <w:rFonts w:ascii="Arial" w:hAnsi="Arial" w:eastAsia="Arial" w:cs="Arial"/>
+          <w:b/>
+          <w:i w:val="0"/>
+          <w:color w:val="000000"/>
+          <w:sz w:val="18"/>
+          <w:highlight w:val="lightGray"/>
+        </w:rPr>
+        <w:t>t</w:t>
+      </w:r>
+      <w:r>
+        <w:rPr>
+          <w:rFonts w:ascii="Arial" w:hAnsi="Arial" w:eastAsia="Arial" w:cs="Arial"/>
+          <w:b/>
+          <w:i w:val="0"/>
+          <w:color w:val="000000"/>
+          <w:sz w:val="18"/>
+          <w:highlight w:val="lightGray"/>
+        </w:rPr>
+        <w:t>h</w:t>
+      </w:r>
+      <w:r>
+        <w:rPr>
+          <w:rFonts w:ascii="Arial" w:hAnsi="Arial" w:eastAsia="Arial" w:cs="Arial"/>
+          <w:b w:val="0"/>
+          <w:i w:val="0"/>
+          <w:color w:val="000000"/>
+          <w:sz w:val="18"/>
+          <w:highlight w:val="lightGray"/>
+        </w:rPr>
+        <w:t>:</w:t>
+      </w:r>
+      <w:r>
+        <w:rPr>
+          <w:rFonts w:ascii="Arial" w:hAnsi="Arial" w:eastAsia="Arial" w:cs="Arial"/>
+          <w:b w:val="0"/>
+          <w:i w:val="0"/>
+          <w:color w:val="000000"/>
+          <w:sz w:val="18"/>
+          <w:highlight w:val="lightGray"/>
+        </w:rPr>
+        <w:t xml:space="preserve"> </w:t>
+      </w:r>
+      <w:r>
+        <w:rPr>
+          <w:rFonts w:ascii="Arial" w:hAnsi="Arial" w:eastAsia="Arial" w:cs="Arial"/>
+          <w:b w:val="0"/>
+          <w:i w:val="0"/>
+          <w:color w:val="000000"/>
+          <w:sz w:val="18"/>
+          <w:highlight w:val="lightGray"/>
+        </w:rPr>
+        <w:t>P</w:t>
+      </w:r>
+      <w:r>
+        <w:rPr>
+          <w:rFonts w:ascii="Arial" w:hAnsi="Arial" w:eastAsia="Arial" w:cs="Arial"/>
+          <w:b w:val="0"/>
+          <w:i w:val="0"/>
+          <w:color w:val="000000"/>
+          <w:sz w:val="18"/>
+          <w:highlight w:val="lightGray"/>
+        </w:rPr>
+        <w:t>e</w:t>
+      </w:r>
+      <w:r>
+        <w:rPr>
+          <w:rFonts w:ascii="Arial" w:hAnsi="Arial" w:eastAsia="Arial" w:cs="Arial"/>
+          <w:b w:val="0"/>
+          <w:i w:val="0"/>
+          <w:color w:val="000000"/>
+          <w:sz w:val="18"/>
+          <w:highlight w:val="lightGray"/>
+        </w:rPr>
+        <w:t>r</w:t>
+      </w:r>
+      <w:r>
+        <w:rPr>
+          <w:rFonts w:ascii="Arial" w:hAnsi="Arial" w:eastAsia="Arial" w:cs="Arial"/>
+          <w:b w:val="0"/>
+          <w:i w:val="0"/>
+          <w:color w:val="000000"/>
+          <w:sz w:val="18"/>
+          <w:highlight w:val="lightGray"/>
+        </w:rPr>
+        <w:t>s</w:t>
+      </w:r>
+      <w:r>
+        <w:rPr>
+          <w:rFonts w:ascii="Arial" w:hAnsi="Arial" w:eastAsia="Arial" w:cs="Arial"/>
+          <w:b w:val="0"/>
+          <w:i w:val="0"/>
+          <w:color w:val="000000"/>
+          <w:sz w:val="18"/>
+          <w:highlight w:val="lightGray"/>
+        </w:rPr>
+        <w:t>o</w:t>
+      </w:r>
+      <w:r>
+        <w:rPr>
+          <w:rFonts w:ascii="Arial" w:hAnsi="Arial" w:eastAsia="Arial" w:cs="Arial"/>
+          <w:b w:val="0"/>
+          <w:i w:val="0"/>
+          <w:color w:val="000000"/>
+          <w:sz w:val="18"/>
+          <w:highlight w:val="lightGray"/>
+        </w:rPr>
+        <w:t>n</w:t>
+      </w:r>
+      <w:r>
+        <w:rPr>
+          <w:rFonts w:ascii="Arial" w:hAnsi="Arial" w:eastAsia="Arial" w:cs="Arial"/>
+          <w:b w:val="0"/>
+          <w:i w:val="0"/>
+          <w:color w:val="000000"/>
+          <w:sz w:val="18"/>
+          <w:highlight w:val="lightGray"/>
+        </w:rPr>
+        <w:t>s</w:t>
+      </w:r>
+      <w:r>
+        <w:rPr>
+          <w:rFonts w:ascii="Arial" w:hAnsi="Arial" w:eastAsia="Arial" w:cs="Arial"/>
+          <w:b w:val="0"/>
+          <w:i w:val="0"/>
+          <w:color w:val="000000"/>
+          <w:sz w:val="18"/>
+          <w:highlight w:val="lightGray"/>
+        </w:rPr>
+        <w:t xml:space="preserve"> </w:t>
+      </w:r>
+      <w:r>
+        <w:rPr>
+          <w:rFonts w:ascii="Arial" w:hAnsi="Arial" w:eastAsia="Arial" w:cs="Arial"/>
+          <w:b w:val="0"/>
+          <w:i w:val="0"/>
+          <w:color w:val="000000"/>
+          <w:sz w:val="18"/>
+          <w:highlight w:val="lightGray"/>
+        </w:rPr>
+        <w:t>T</w:t>
+      </w:r>
+      <w:r>
+        <w:rPr>
+          <w:rFonts w:ascii="Arial" w:hAnsi="Arial" w:eastAsia="Arial" w:cs="Arial"/>
+          <w:b w:val="0"/>
+          <w:i w:val="0"/>
+          <w:color w:val="000000"/>
+          <w:sz w:val="18"/>
+          <w:highlight w:val="lightGray"/>
+        </w:rPr>
+        <w:t>a</w:t>
+      </w:r>
+      <w:r>
+        <w:rPr>
+          <w:rFonts w:ascii="Arial" w:hAnsi="Arial" w:eastAsia="Arial" w:cs="Arial"/>
+          <w:b w:val="0"/>
+          <w:i w:val="0"/>
+          <w:color w:val="000000"/>
+          <w:sz w:val="18"/>
+          <w:highlight w:val="lightGray"/>
+        </w:rPr>
+        <w:t>b</w:t>
+      </w:r>
+      <w:r>
+        <w:rPr>
+          <w:rFonts w:ascii="Arial" w:hAnsi="Arial" w:eastAsia="Arial" w:cs="Arial"/>
+          <w:b w:val="0"/>
+          <w:i w:val="0"/>
+          <w:color w:val="000000"/>
+          <w:sz w:val="18"/>
+          <w:highlight w:val="lightGray"/>
+        </w:rPr>
+        <w:t>l</w:t>
+      </w:r>
+      <w:r>
+        <w:rPr>
+          <w:rFonts w:ascii="Arial" w:hAnsi="Arial" w:eastAsia="Arial" w:cs="Arial"/>
+          <w:b w:val="0"/>
+          <w:i w:val="0"/>
+          <w:color w:val="000000"/>
+          <w:sz w:val="18"/>
+          <w:highlight w:val="lightGray"/>
+        </w:rPr>
+        <w:t>e</w:t>
+      </w:r>
+      <w:r>
+        <w:rPr>
+          <w:rFonts w:ascii="Arial" w:hAnsi="Arial" w:eastAsia="Arial" w:cs="Arial"/>
+          <w:b w:val="0"/>
+          <w:i w:val="0"/>
+          <w:color w:val="000000"/>
+          <w:sz w:val="18"/>
+          <w:highlight w:val="lightGray"/>
+        </w:rPr>
+        <w:t xml:space="preserve"> </w:t>
+      </w:r>
+      <w:r>
+        <w:rPr>
+          <w:rFonts w:ascii="Arial" w:hAnsi="Arial" w:eastAsia="Arial" w:cs="Arial"/>
+          <w:b w:val="0"/>
+          <w:i w:val="0"/>
+          <w:color w:val="000000"/>
+          <w:sz w:val="18"/>
+          <w:highlight w:val="lightGray"/>
+        </w:rPr>
+        <w:t>-</w:t>
+      </w:r>
+      <w:r>
+        <w:rPr>
+          <w:rFonts w:ascii="Arial" w:hAnsi="Arial" w:eastAsia="Arial" w:cs="Arial"/>
+          <w:b w:val="0"/>
+          <w:i w:val="0"/>
+          <w:color w:val="000000"/>
+          <w:sz w:val="18"/>
+          <w:highlight w:val="lightGray"/>
+        </w:rPr>
+        <w:t>&gt;</w:t>
+      </w:r>
+      <w:r>
+        <w:rPr>
+          <w:rFonts w:ascii="Arial" w:hAnsi="Arial" w:eastAsia="Arial" w:cs="Arial"/>
+          <w:b w:val="0"/>
+          <w:i w:val="0"/>
+          <w:color w:val="000000"/>
+          <w:sz w:val="18"/>
+          <w:highlight w:val="lightGray"/>
+        </w:rPr>
+        <w:t xml:space="preserve"> </w:t>
+      </w:r>
+      <w:r>
+        <w:rPr>
+          <w:rFonts w:ascii="Arial" w:hAnsi="Arial" w:eastAsia="Arial" w:cs="Arial"/>
+          <w:b w:val="0"/>
+          <w:i w:val="0"/>
+          <w:color w:val="000000"/>
+          <w:sz w:val="18"/>
+          <w:highlight w:val="lightGray"/>
+        </w:rPr>
+        <w:t>I</w:t>
+      </w:r>
+      <w:r>
+        <w:rPr>
+          <w:rFonts w:ascii="Arial" w:hAnsi="Arial" w:eastAsia="Arial" w:cs="Arial"/>
+          <w:b w:val="0"/>
+          <w:i w:val="0"/>
+          <w:color w:val="000000"/>
+          <w:sz w:val="18"/>
+          <w:highlight w:val="lightGray"/>
+        </w:rPr>
+        <w:t>D</w:t>
+      </w:r>
+      <w:r>
+        <w:rPr>
+          <w:rFonts w:ascii="Arial" w:hAnsi="Arial" w:eastAsia="Arial" w:cs="Arial"/>
+          <w:b w:val="0"/>
+          <w:i w:val="0"/>
+          <w:color w:val="000000"/>
+          <w:sz w:val="18"/>
+          <w:highlight w:val="lightGray"/>
+        </w:rPr>
+        <w:t xml:space="preserve"> </w:t>
+      </w:r>
+      <w:r>
+        <w:rPr>
+          <w:rFonts w:ascii="Arial" w:hAnsi="Arial" w:eastAsia="Arial" w:cs="Arial"/>
+          <w:b w:val="0"/>
+          <w:i w:val="0"/>
+          <w:color w:val="000000"/>
+          <w:sz w:val="18"/>
+          <w:highlight w:val="lightGray"/>
+        </w:rPr>
+        <w:t>C</w:t>
+      </w:r>
+      <w:r>
+        <w:rPr>
+          <w:rFonts w:ascii="Arial" w:hAnsi="Arial" w:eastAsia="Arial" w:cs="Arial"/>
+          <w:b w:val="0"/>
+          <w:i w:val="0"/>
+          <w:color w:val="000000"/>
+          <w:sz w:val="18"/>
+          <w:highlight w:val="lightGray"/>
+        </w:rPr>
+        <w:t>o</w:t>
+      </w:r>
+      <w:r>
+        <w:rPr>
+          <w:rFonts w:ascii="Arial" w:hAnsi="Arial" w:eastAsia="Arial" w:cs="Arial"/>
+          <w:b w:val="0"/>
+          <w:i w:val="0"/>
+          <w:color w:val="000000"/>
+          <w:sz w:val="18"/>
+          <w:highlight w:val="lightGray"/>
+        </w:rPr>
+        <w:t>l</w:t>
+      </w:r>
+      <w:r>
+        <w:rPr>
+          <w:rFonts w:ascii="Arial" w:hAnsi="Arial" w:eastAsia="Arial" w:cs="Arial"/>
+          <w:b w:val="0"/>
+          <w:i w:val="0"/>
+          <w:color w:val="000000"/>
+          <w:sz w:val="18"/>
+          <w:highlight w:val="lightGray"/>
+        </w:rPr>
+        <w:t>u</w:t>
+      </w:r>
+      <w:r>
+        <w:rPr>
+          <w:rFonts w:ascii="Arial" w:hAnsi="Arial" w:eastAsia="Arial" w:cs="Arial"/>
+          <w:b w:val="0"/>
+          <w:i w:val="0"/>
+          <w:color w:val="000000"/>
+          <w:sz w:val="18"/>
+          <w:highlight w:val="lightGray"/>
+        </w:rPr>
+        <w:t>m</w:t>
+      </w:r>
+      <w:r>
+        <w:rPr>
+          <w:rFonts w:ascii="Arial" w:hAnsi="Arial" w:eastAsia="Arial" w:cs="Arial"/>
+          <w:b w:val="0"/>
+          <w:i w:val="0"/>
+          <w:color w:val="000000"/>
+          <w:sz w:val="18"/>
+          <w:highlight w:val="lightGray"/>
+        </w:rPr>
+        <w:t>n</w:t>
+      </w:r>
+      <w:r>
+        <w:rPr>
+          <w:rFonts w:ascii="Arial" w:hAnsi="Arial" w:eastAsia="Arial" w:cs="Arial"/>
+          <w:b w:val="0"/>
+          <w:i w:val="0"/>
+          <w:color w:val="000000"/>
+          <w:sz w:val="18"/>
+          <w:highlight w:val="lightGray"/>
+        </w:rPr>
+        <w:t>:</w:t>
+      </w:r>
+      <w:r>
+        <w:rPr>
+          <w:rFonts w:ascii="Arial" w:hAnsi="Arial" w:eastAsia="Arial" w:cs="Arial"/>
+          <w:b w:val="0"/>
+          <w:i w:val="0"/>
+          <w:color w:val="000000"/>
+          <w:sz w:val="18"/>
+          <w:highlight w:val="lightGray"/>
+        </w:rPr>
+        <w:t xml:space="preserve"> </w:t>
+      </w:r>
+      <w:r>
+        <w:rPr>
+          <w:rFonts w:ascii="Arial" w:hAnsi="Arial" w:eastAsia="Arial" w:cs="Arial"/>
+          <w:b w:val="0"/>
+          <w:i w:val="0"/>
+          <w:color w:val="000000"/>
+          <w:sz w:val="18"/>
+          <w:highlight w:val="lightGray"/>
+        </w:rPr>
+        <w:t>1</w:t>
+      </w:r>
+      <w:r>
+        <w:rPr>
+          <w:rFonts w:ascii="Arial" w:hAnsi="Arial" w:eastAsia="Arial" w:cs="Arial"/>
+          <w:b w:val="0"/>
+          <w:i w:val="0"/>
+          <w:color w:val="000000"/>
+          <w:sz w:val="18"/>
+          <w:highlight w:val="lightGray"/>
+        </w:rPr>
+        <w:t>,</w:t>
+      </w:r>
+      <w:r>
+        <w:rPr>
+          <w:rFonts w:ascii="Arial" w:hAnsi="Arial" w:eastAsia="Arial" w:cs="Arial"/>
+          <w:b w:val="0"/>
+          <w:i w:val="0"/>
+          <w:color w:val="000000"/>
+          <w:sz w:val="18"/>
+          <w:highlight w:val="lightGray"/>
+        </w:rPr>
+        <w:t xml:space="preserve"> </w:t>
+      </w:r>
+      <w:r>
+        <w:rPr>
+          <w:rFonts w:ascii="Arial" w:hAnsi="Arial" w:eastAsia="Arial" w:cs="Arial"/>
+          <w:b w:val="0"/>
+          <w:i w:val="0"/>
+          <w:color w:val="000000"/>
+          <w:sz w:val="18"/>
+          <w:highlight w:val="lightGray"/>
+        </w:rPr>
+        <w:t>N</w:t>
+      </w:r>
+      <w:r>
+        <w:rPr>
+          <w:rFonts w:ascii="Arial" w:hAnsi="Arial" w:eastAsia="Arial" w:cs="Arial"/>
+          <w:b w:val="0"/>
+          <w:i w:val="0"/>
+          <w:color w:val="000000"/>
+          <w:sz w:val="18"/>
+          <w:highlight w:val="lightGray"/>
+        </w:rPr>
+        <w:t>a</w:t>
+      </w:r>
+      <w:r>
+        <w:rPr>
+          <w:rFonts w:ascii="Arial" w:hAnsi="Arial" w:eastAsia="Arial" w:cs="Arial"/>
+          <w:b w:val="0"/>
+          <w:i w:val="0"/>
+          <w:color w:val="000000"/>
+          <w:sz w:val="18"/>
+          <w:highlight w:val="lightGray"/>
+        </w:rPr>
+        <w:t>m</w:t>
+      </w:r>
+      <w:r>
+        <w:rPr>
+          <w:rFonts w:ascii="Arial" w:hAnsi="Arial" w:eastAsia="Arial" w:cs="Arial"/>
+          <w:b w:val="0"/>
+          <w:i w:val="0"/>
+          <w:color w:val="000000"/>
+          <w:sz w:val="18"/>
+          <w:highlight w:val="lightGray"/>
+        </w:rPr>
+        <w:t>e</w:t>
+      </w:r>
+      <w:r>
+        <w:rPr>
+          <w:rFonts w:ascii="Arial" w:hAnsi="Arial" w:eastAsia="Arial" w:cs="Arial"/>
+          <w:b w:val="0"/>
+          <w:i w:val="0"/>
+          <w:color w:val="000000"/>
+          <w:sz w:val="18"/>
+          <w:highlight w:val="lightGray"/>
+        </w:rPr>
+        <w:t>_</w:t>
+      </w:r>
+      <w:r>
+        <w:rPr>
+          <w:rFonts w:ascii="Arial" w:hAnsi="Arial" w:eastAsia="Arial" w:cs="Arial"/>
+          <w:b w:val="0"/>
+          <w:i w:val="0"/>
+          <w:color w:val="000000"/>
+          <w:sz w:val="18"/>
+          <w:highlight w:val="lightGray"/>
+        </w:rPr>
+        <w:t>E</w:t>
+      </w:r>
+      <w:r>
+        <w:rPr>
+          <w:rFonts w:ascii="Arial" w:hAnsi="Arial" w:eastAsia="Arial" w:cs="Arial"/>
+          <w:b w:val="0"/>
+          <w:i w:val="0"/>
+          <w:color w:val="000000"/>
+          <w:sz w:val="18"/>
+          <w:highlight w:val="lightGray"/>
+        </w:rPr>
+        <w:t>n</w:t>
+      </w:r>
+      <w:r>
+        <w:rPr>
+          <w:rFonts w:ascii="Arial" w:hAnsi="Arial" w:eastAsia="Arial" w:cs="Arial"/>
+          <w:b w:val="0"/>
+          <w:i w:val="0"/>
+          <w:color w:val="000000"/>
+          <w:sz w:val="18"/>
+          <w:highlight w:val="lightGray"/>
+        </w:rPr>
+        <w:t xml:space="preserve"> </w:t>
+      </w:r>
+      <w:r>
+        <w:rPr>
+          <w:rFonts w:ascii="Arial" w:hAnsi="Arial" w:eastAsia="Arial" w:cs="Arial"/>
+          <w:b w:val="0"/>
+          <w:i w:val="0"/>
+          <w:color w:val="000000"/>
+          <w:sz w:val="18"/>
+          <w:highlight w:val="lightGray"/>
+        </w:rPr>
+        <w:t>C</w:t>
+      </w:r>
+      <w:r>
+        <w:rPr>
+          <w:rFonts w:ascii="Arial" w:hAnsi="Arial" w:eastAsia="Arial" w:cs="Arial"/>
+          <w:b w:val="0"/>
+          <w:i w:val="0"/>
+          <w:color w:val="000000"/>
+          <w:sz w:val="18"/>
+          <w:highlight w:val="lightGray"/>
+        </w:rPr>
+        <w:t>o</w:t>
+      </w:r>
+      <w:r>
+        <w:rPr>
+          <w:rFonts w:ascii="Arial" w:hAnsi="Arial" w:eastAsia="Arial" w:cs="Arial"/>
+          <w:b w:val="0"/>
+          <w:i w:val="0"/>
+          <w:color w:val="000000"/>
+          <w:sz w:val="18"/>
+          <w:highlight w:val="lightGray"/>
+        </w:rPr>
+        <w:t>l</w:t>
+      </w:r>
+      <w:r>
+        <w:rPr>
+          <w:rFonts w:ascii="Arial" w:hAnsi="Arial" w:eastAsia="Arial" w:cs="Arial"/>
+          <w:b w:val="0"/>
+          <w:i w:val="0"/>
+          <w:color w:val="000000"/>
+          <w:sz w:val="18"/>
+          <w:highlight w:val="lightGray"/>
+        </w:rPr>
+        <w:t>u</w:t>
+      </w:r>
+      <w:r>
+        <w:rPr>
+          <w:rFonts w:ascii="Arial" w:hAnsi="Arial" w:eastAsia="Arial" w:cs="Arial"/>
+          <w:b w:val="0"/>
+          <w:i w:val="0"/>
+          <w:color w:val="000000"/>
+          <w:sz w:val="18"/>
+          <w:highlight w:val="lightGray"/>
+        </w:rPr>
+        <w:t>m</w:t>
+      </w:r>
+      <w:r>
+        <w:rPr>
+          <w:rFonts w:ascii="Arial" w:hAnsi="Arial" w:eastAsia="Arial" w:cs="Arial"/>
+          <w:b w:val="0"/>
+          <w:i w:val="0"/>
+          <w:color w:val="000000"/>
+          <w:sz w:val="18"/>
+          <w:highlight w:val="lightGray"/>
+        </w:rPr>
+        <w:t>n</w:t>
+      </w:r>
+      <w:r>
+        <w:rPr>
+          <w:rFonts w:ascii="Arial" w:hAnsi="Arial" w:eastAsia="Arial" w:cs="Arial"/>
+          <w:b w:val="0"/>
+          <w:i w:val="0"/>
+          <w:color w:val="000000"/>
+          <w:sz w:val="18"/>
+          <w:highlight w:val="lightGray"/>
+        </w:rPr>
+        <w:t>:</w:t>
+      </w:r>
+      <w:r>
+        <w:rPr>
+          <w:rFonts w:ascii="Arial" w:hAnsi="Arial" w:eastAsia="Arial" w:cs="Arial"/>
+          <w:b w:val="0"/>
+          <w:i w:val="0"/>
+          <w:color w:val="000000"/>
+          <w:sz w:val="18"/>
+          <w:highlight w:val="lightGray"/>
+        </w:rPr>
+        <w:t xml:space="preserve"> </w:t>
+      </w:r>
+      <w:r>
+        <w:rPr>
+          <w:rFonts w:ascii="Arial" w:hAnsi="Arial" w:eastAsia="Arial" w:cs="Arial"/>
+          <w:b w:val="0"/>
+          <w:i w:val="0"/>
+          <w:color w:val="000000"/>
+          <w:sz w:val="18"/>
+          <w:highlight w:val="lightGray"/>
+        </w:rPr>
+        <w:t>M</w:t>
+      </w:r>
+      <w:r>
+        <w:rPr>
+          <w:rFonts w:ascii="Arial" w:hAnsi="Arial" w:eastAsia="Arial" w:cs="Arial"/>
+          <w:b w:val="0"/>
+          <w:i w:val="0"/>
+          <w:color w:val="000000"/>
+          <w:sz w:val="18"/>
+          <w:highlight w:val="lightGray"/>
+        </w:rPr>
+        <w:t>o</w:t>
+      </w:r>
+      <w:r>
+        <w:rPr>
+          <w:rFonts w:ascii="Arial" w:hAnsi="Arial" w:eastAsia="Arial" w:cs="Arial"/>
+          <w:b w:val="0"/>
+          <w:i w:val="0"/>
+          <w:color w:val="000000"/>
+          <w:sz w:val="18"/>
+          <w:highlight w:val="lightGray"/>
+        </w:rPr>
+        <w:t>t</w:t>
+      </w:r>
+      <w:r>
+        <w:rPr>
+          <w:rFonts w:ascii="Arial" w:hAnsi="Arial" w:eastAsia="Arial" w:cs="Arial"/>
+          <w:b w:val="0"/>
+          <w:i w:val="0"/>
+          <w:color w:val="000000"/>
+          <w:sz w:val="18"/>
+          <w:highlight w:val="lightGray"/>
+        </w:rPr>
+        <w:t>a</w:t>
+      </w:r>
+      <w:r>
+        <w:rPr>
+          <w:rFonts w:ascii="Arial" w:hAnsi="Arial" w:eastAsia="Arial" w:cs="Arial"/>
+          <w:b w:val="0"/>
+          <w:i w:val="0"/>
+          <w:color w:val="000000"/>
+          <w:sz w:val="18"/>
+          <w:highlight w:val="lightGray"/>
+        </w:rPr>
+        <w:t>s</w:t>
+      </w:r>
+      <w:r>
+        <w:rPr>
+          <w:rFonts w:ascii="Arial" w:hAnsi="Arial" w:eastAsia="Arial" w:cs="Arial"/>
+          <w:b w:val="0"/>
+          <w:i w:val="0"/>
+          <w:color w:val="000000"/>
+          <w:sz w:val="18"/>
+          <w:highlight w:val="lightGray"/>
+        </w:rPr>
+        <w:t>e</w:t>
+      </w:r>
+      <w:r>
+        <w:rPr>
+          <w:rFonts w:ascii="Arial" w:hAnsi="Arial" w:eastAsia="Arial" w:cs="Arial"/>
+          <w:b w:val="0"/>
+          <w:i w:val="0"/>
+          <w:color w:val="000000"/>
+          <w:sz w:val="18"/>
+          <w:highlight w:val="lightGray"/>
+        </w:rPr>
+        <w:t>m</w:t>
+      </w:r>
+      <w:r>
+        <w:rPr>
+          <w:rFonts w:ascii="Arial" w:hAnsi="Arial" w:eastAsia="Arial" w:cs="Arial"/>
+          <w:b w:val="0"/>
+          <w:i w:val="0"/>
+          <w:color w:val="000000"/>
+          <w:sz w:val="18"/>
+          <w:highlight w:val="lightGray"/>
+        </w:rPr>
+        <w:t xml:space="preserve"> </w:t>
+      </w:r>
+      <w:r>
+        <w:rPr>
+          <w:rFonts w:ascii="Arial" w:hAnsi="Arial" w:eastAsia="Arial" w:cs="Arial"/>
+          <w:b w:val="0"/>
+          <w:i w:val="0"/>
+          <w:color w:val="000000"/>
+          <w:sz w:val="18"/>
+          <w:highlight w:val="lightGray"/>
+        </w:rPr>
+        <w:t>E</w:t>
+      </w:r>
+      <w:r>
+        <w:rPr>
+          <w:rFonts w:ascii="Arial" w:hAnsi="Arial" w:eastAsia="Arial" w:cs="Arial"/>
+          <w:b w:val="0"/>
+          <w:i w:val="0"/>
+          <w:color w:val="000000"/>
+          <w:sz w:val="18"/>
+          <w:highlight w:val="lightGray"/>
+        </w:rPr>
+        <w:t>s</w:t>
+      </w:r>
+      <w:r>
+        <w:rPr>
+          <w:rFonts w:ascii="Arial" w:hAnsi="Arial" w:eastAsia="Arial" w:cs="Arial"/>
+          <w:b w:val="0"/>
+          <w:i w:val="0"/>
+          <w:color w:val="000000"/>
+          <w:sz w:val="18"/>
+          <w:highlight w:val="lightGray"/>
+        </w:rPr>
+        <w:t>s</w:t>
+      </w:r>
+      <w:r>
+        <w:rPr>
+          <w:rFonts w:ascii="Arial" w:hAnsi="Arial" w:eastAsia="Arial" w:cs="Arial"/>
+          <w:b w:val="0"/>
+          <w:i w:val="0"/>
+          <w:color w:val="000000"/>
+          <w:sz w:val="18"/>
+          <w:highlight w:val="lightGray"/>
+        </w:rPr>
+        <w:t>a</w:t>
+      </w:r>
+      <w:r>
+        <w:rPr>
+          <w:rFonts w:ascii="Arial" w:hAnsi="Arial" w:eastAsia="Arial" w:cs="Arial"/>
+          <w:b w:val="0"/>
+          <w:i w:val="0"/>
+          <w:color w:val="000000"/>
+          <w:sz w:val="18"/>
+          <w:highlight w:val="lightGray"/>
+        </w:rPr>
+        <w:t>m</w:t>
+      </w:r>
+      <w:r>
+        <w:rPr>
+          <w:rFonts w:ascii="Arial" w:hAnsi="Arial" w:eastAsia="Arial" w:cs="Arial"/>
+          <w:b w:val="0"/>
+          <w:i w:val="0"/>
+          <w:color w:val="000000"/>
+          <w:sz w:val="18"/>
+          <w:highlight w:val="lightGray"/>
+        </w:rPr>
+        <w:t>]</w:t>
+      </w:r>
+      <w:r>
+        <w:rPr>
+          <w:rFonts w:ascii="Arial" w:hAnsi="Arial" w:eastAsia="Arial" w:cs="Arial"/>
+          <w:b w:val="0"/>
+          <w:i w:val="0"/>
+          <w:color w:val="000000"/>
+          <w:sz w:val="18"/>
+          <w:highlight w:val="lightGray"/>
+        </w:rPr>
+        <w:t xml:space="preserve"> </w:t>
+      </w:r>
+      <w:r>
+        <w:rPr>
+          <w:rFonts w:ascii="Arial" w:hAnsi="Arial" w:eastAsia="Arial" w:cs="Arial"/>
+          <w:b w:val="0"/>
+          <w:i w:val="0"/>
+          <w:color w:val="000000"/>
+          <w:sz w:val="18"/>
+          <w:highlight w:val="lightGray"/>
+        </w:rPr>
+        <w:t>-</w:t>
+      </w:r>
+      <w:r>
+        <w:rPr>
+          <w:rFonts w:ascii="Arial" w:hAnsi="Arial" w:eastAsia="Arial" w:cs="Arial"/>
+          <w:b w:val="0"/>
+          <w:i w:val="0"/>
+          <w:color w:val="000000"/>
+          <w:sz w:val="18"/>
+          <w:highlight w:val="lightGray"/>
+        </w:rPr>
+        <w:t>&gt;</w:t>
+      </w:r>
+      <w:r>
+        <w:rPr>
+          <w:rFonts w:ascii="Arial" w:hAnsi="Arial" w:eastAsia="Arial" w:cs="Arial"/>
+          <w:b w:val="0"/>
+          <w:i w:val="0"/>
+          <w:color w:val="000000"/>
+          <w:sz w:val="18"/>
+          <w:highlight w:val="lightGray"/>
+        </w:rPr>
+        <w:t xml:space="preserve"> </w:t>
+      </w:r>
+      <w:r>
+        <w:rPr>
+          <w:rFonts w:ascii="Arial" w:hAnsi="Arial" w:eastAsia="Arial" w:cs="Arial"/>
+          <w:b/>
+          <w:i w:val="0"/>
+          <w:color w:val="000000"/>
+          <w:sz w:val="18"/>
+          <w:highlight w:val="lightGray"/>
+        </w:rPr>
+        <w:t>F</w:t>
+      </w:r>
+      <w:r>
+        <w:rPr>
+          <w:rFonts w:ascii="Arial" w:hAnsi="Arial" w:eastAsia="Arial" w:cs="Arial"/>
+          <w:b/>
+          <w:i w:val="0"/>
+          <w:color w:val="000000"/>
+          <w:sz w:val="18"/>
+          <w:highlight w:val="lightGray"/>
+        </w:rPr>
+        <w:t>r</w:t>
+      </w:r>
+      <w:r>
+        <w:rPr>
+          <w:rFonts w:ascii="Arial" w:hAnsi="Arial" w:eastAsia="Arial" w:cs="Arial"/>
+          <w:b/>
+          <w:i w:val="0"/>
+          <w:color w:val="000000"/>
+          <w:sz w:val="18"/>
+          <w:highlight w:val="lightGray"/>
+        </w:rPr>
+        <w:t>o</w:t>
+      </w:r>
+      <w:r>
+        <w:rPr>
+          <w:rFonts w:ascii="Arial" w:hAnsi="Arial" w:eastAsia="Arial" w:cs="Arial"/>
+          <w:b/>
+          <w:i w:val="0"/>
+          <w:color w:val="000000"/>
+          <w:sz w:val="18"/>
+          <w:highlight w:val="lightGray"/>
+        </w:rPr>
+        <w:t>m</w:t>
+      </w:r>
+      <w:r>
+        <w:rPr>
+          <w:rFonts w:ascii="Arial" w:hAnsi="Arial" w:eastAsia="Arial" w:cs="Arial"/>
+          <w:b/>
+          <w:i w:val="0"/>
+          <w:color w:val="000000"/>
+          <w:sz w:val="18"/>
+          <w:highlight w:val="lightGray"/>
+        </w:rPr>
+        <w:t>:</w:t>
+      </w:r>
+      <w:r>
+        <w:rPr>
+          <w:rFonts w:ascii="Arial" w:hAnsi="Arial" w:eastAsia="Arial" w:cs="Arial"/>
+          <w:b w:val="0"/>
+          <w:i w:val="0"/>
+          <w:color w:val="000000"/>
+          <w:sz w:val="18"/>
+          <w:highlight w:val="lightGray"/>
+        </w:rPr>
+        <w:t xml:space="preserve"> </w:t>
+      </w:r>
+      <w:r>
+        <w:rPr>
+          <w:rFonts w:ascii="Arial" w:hAnsi="Arial" w:eastAsia="Arial" w:cs="Arial"/>
+          <w:b w:val="0"/>
+          <w:i w:val="0"/>
+          <w:color w:val="000000"/>
+          <w:sz w:val="18"/>
+          <w:highlight w:val="lightGray"/>
+        </w:rPr>
+        <w:t>[</w:t>
+      </w:r>
+      <w:r>
+        <w:rPr>
+          <w:rFonts w:ascii="Arial" w:hAnsi="Arial" w:eastAsia="Arial" w:cs="Arial"/>
+          <w:b w:val="0"/>
+          <w:i w:val="0"/>
+          <w:color w:val="000000"/>
+          <w:sz w:val="18"/>
+          <w:highlight w:val="lightGray"/>
+        </w:rPr>
+        <w:t>C</w:t>
+      </w:r>
+      <w:r>
+        <w:rPr>
+          <w:rFonts w:ascii="Arial" w:hAnsi="Arial" w:eastAsia="Arial" w:cs="Arial"/>
+          <w:b w:val="0"/>
+          <w:i w:val="0"/>
+          <w:color w:val="000000"/>
+          <w:sz w:val="18"/>
+          <w:highlight w:val="lightGray"/>
+        </w:rPr>
+        <w:t>h</w:t>
+      </w:r>
+      <w:r>
+        <w:rPr>
+          <w:rFonts w:ascii="Arial" w:hAnsi="Arial" w:eastAsia="Arial" w:cs="Arial"/>
+          <w:b w:val="0"/>
+          <w:i w:val="0"/>
+          <w:color w:val="000000"/>
+          <w:sz w:val="18"/>
+          <w:highlight w:val="lightGray"/>
+        </w:rPr>
+        <w:t>a</w:t>
+      </w:r>
+      <w:r>
+        <w:rPr>
+          <w:rFonts w:ascii="Arial" w:hAnsi="Arial" w:eastAsia="Arial" w:cs="Arial"/>
+          <w:b w:val="0"/>
+          <w:i w:val="0"/>
+          <w:color w:val="000000"/>
+          <w:sz w:val="18"/>
+          <w:highlight w:val="lightGray"/>
+        </w:rPr>
+        <w:t>t</w:t>
+      </w:r>
+      <w:r>
+        <w:rPr>
+          <w:rFonts w:ascii="Arial" w:hAnsi="Arial" w:eastAsia="Arial" w:cs="Arial"/>
+          <w:b w:val="0"/>
+          <w:i w:val="0"/>
+          <w:color w:val="000000"/>
+          <w:sz w:val="18"/>
+          <w:highlight w:val="lightGray"/>
+        </w:rPr>
+        <w:t>G</w:t>
+      </w:r>
+      <w:r>
+        <w:rPr>
+          <w:rFonts w:ascii="Arial" w:hAnsi="Arial" w:eastAsia="Arial" w:cs="Arial"/>
+          <w:b w:val="0"/>
+          <w:i w:val="0"/>
+          <w:color w:val="000000"/>
+          <w:sz w:val="18"/>
+          <w:highlight w:val="lightGray"/>
+        </w:rPr>
+        <w:t>P</w:t>
+      </w:r>
+      <w:r>
+        <w:rPr>
+          <w:rFonts w:ascii="Arial" w:hAnsi="Arial" w:eastAsia="Arial" w:cs="Arial"/>
+          <w:b w:val="0"/>
+          <w:i w:val="0"/>
+          <w:color w:val="000000"/>
+          <w:sz w:val="18"/>
+          <w:highlight w:val="lightGray"/>
+        </w:rPr>
+        <w:t>T</w:t>
+      </w:r>
+      <w:r>
+        <w:rPr>
+          <w:rFonts w:ascii="Arial" w:hAnsi="Arial" w:eastAsia="Arial" w:cs="Arial"/>
+          <w:b w:val="0"/>
+          <w:i w:val="0"/>
+          <w:color w:val="000000"/>
+          <w:sz w:val="18"/>
+          <w:highlight w:val="lightGray"/>
+        </w:rPr>
+        <w:t>]</w:t>
+      </w:r>
+      <w:r>
+        <w:rPr>
+          <w:rFonts w:ascii="Arial" w:hAnsi="Arial" w:eastAsia="Arial" w:cs="Arial"/>
+          <w:b w:val="0"/>
+          <w:i w:val="0"/>
+          <w:color w:val="000000"/>
+          <w:sz w:val="18"/>
+          <w:highlight w:val="lightGray"/>
+        </w:rPr>
+        <w:t xml:space="preserve"> </w:t>
+      </w:r>
+      <w:r>
+        <w:rPr>
+          <w:rFonts w:ascii="Arial" w:hAnsi="Arial" w:eastAsia="Arial" w:cs="Arial"/>
+          <w:b/>
+          <w:i w:val="0"/>
+          <w:color w:val="000000"/>
+          <w:sz w:val="18"/>
+          <w:highlight w:val="lightGray"/>
+        </w:rPr>
+        <w:t>o</w:t>
+      </w:r>
+      <w:r>
+        <w:rPr>
+          <w:rFonts w:ascii="Arial" w:hAnsi="Arial" w:eastAsia="Arial" w:cs="Arial"/>
+          <w:b/>
+          <w:i w:val="0"/>
+          <w:color w:val="000000"/>
+          <w:sz w:val="18"/>
+          <w:highlight w:val="lightGray"/>
+        </w:rPr>
+        <w:t>n</w:t>
+      </w:r>
+      <w:r>
+        <w:rPr>
+          <w:rFonts w:ascii="Arial" w:hAnsi="Arial" w:eastAsia="Arial" w:cs="Arial"/>
+          <w:b/>
+          <w:i w:val="0"/>
+          <w:color w:val="000000"/>
+          <w:sz w:val="18"/>
+          <w:highlight w:val="lightGray"/>
+        </w:rPr>
+        <w:t xml:space="preserve"> </w:t>
+      </w:r>
+      <w:r>
+        <w:rPr>
+          <w:rFonts w:ascii="Arial" w:hAnsi="Arial" w:eastAsia="Arial" w:cs="Arial"/>
+          <w:b w:val="0"/>
+          <w:i w:val="0"/>
+          <w:color w:val="000000"/>
+          <w:sz w:val="18"/>
+          <w:highlight w:val="lightGray"/>
+        </w:rPr>
+        <w:t>[</w:t>
+      </w:r>
+      <w:r>
+        <w:rPr>
+          <w:rFonts w:ascii="Arial" w:hAnsi="Arial" w:eastAsia="Arial" w:cs="Arial"/>
+          <w:b w:val="0"/>
+          <w:i w:val="0"/>
+          <w:color w:val="000000"/>
+          <w:sz w:val="18"/>
+          <w:highlight w:val="lightGray"/>
+        </w:rPr>
+        <w:t>7</w:t>
+      </w:r>
+      <w:r>
+        <w:rPr>
+          <w:rFonts w:ascii="Arial" w:hAnsi="Arial" w:eastAsia="Arial" w:cs="Arial"/>
+          <w:b w:val="0"/>
+          <w:i w:val="0"/>
+          <w:color w:val="000000"/>
+          <w:sz w:val="18"/>
+          <w:highlight w:val="lightGray"/>
+        </w:rPr>
+        <w:t>/</w:t>
+      </w:r>
+      <w:r>
+        <w:rPr>
+          <w:rFonts w:ascii="Arial" w:hAnsi="Arial" w:eastAsia="Arial" w:cs="Arial"/>
+          <w:b w:val="0"/>
+          <w:i w:val="0"/>
+          <w:color w:val="000000"/>
+          <w:sz w:val="18"/>
+          <w:highlight w:val="lightGray"/>
+        </w:rPr>
+        <w:t>2</w:t>
+      </w:r>
+      <w:r>
+        <w:rPr>
+          <w:rFonts w:ascii="Arial" w:hAnsi="Arial" w:eastAsia="Arial" w:cs="Arial"/>
+          <w:b w:val="0"/>
+          <w:i w:val="0"/>
+          <w:color w:val="000000"/>
+          <w:sz w:val="18"/>
+          <w:highlight w:val="lightGray"/>
+        </w:rPr>
+        <w:t>1</w:t>
+      </w:r>
+      <w:r>
+        <w:rPr>
+          <w:rFonts w:ascii="Arial" w:hAnsi="Arial" w:eastAsia="Arial" w:cs="Arial"/>
+          <w:b w:val="0"/>
+          <w:i w:val="0"/>
+          <w:color w:val="000000"/>
+          <w:sz w:val="18"/>
+          <w:highlight w:val="lightGray"/>
+        </w:rPr>
+        <w:t>/</w:t>
+      </w:r>
+      <w:r>
+        <w:rPr>
+          <w:rFonts w:ascii="Arial" w:hAnsi="Arial" w:eastAsia="Arial" w:cs="Arial"/>
+          <w:b w:val="0"/>
+          <w:i w:val="0"/>
+          <w:color w:val="000000"/>
+          <w:sz w:val="18"/>
+          <w:highlight w:val="lightGray"/>
+        </w:rPr>
+        <w:t>2</w:t>
+      </w:r>
+      <w:r>
+        <w:rPr>
+          <w:rFonts w:ascii="Arial" w:hAnsi="Arial" w:eastAsia="Arial" w:cs="Arial"/>
+          <w:b w:val="0"/>
+          <w:i w:val="0"/>
+          <w:color w:val="000000"/>
+          <w:sz w:val="18"/>
+          <w:highlight w:val="lightGray"/>
+        </w:rPr>
+        <w:t>0</w:t>
+      </w:r>
+      <w:r>
+        <w:rPr>
+          <w:rFonts w:ascii="Arial" w:hAnsi="Arial" w:eastAsia="Arial" w:cs="Arial"/>
+          <w:b w:val="0"/>
+          <w:i w:val="0"/>
+          <w:color w:val="000000"/>
+          <w:sz w:val="18"/>
+          <w:highlight w:val="lightGray"/>
+        </w:rPr>
+        <w:t>2</w:t>
+      </w:r>
+      <w:r>
+        <w:rPr>
+          <w:rFonts w:ascii="Arial" w:hAnsi="Arial" w:eastAsia="Arial" w:cs="Arial"/>
+          <w:b w:val="0"/>
+          <w:i w:val="0"/>
+          <w:color w:val="000000"/>
+          <w:sz w:val="18"/>
+          <w:highlight w:val="lightGray"/>
+        </w:rPr>
+        <w:t>5</w:t>
+      </w:r>
+      <w:r>
+        <w:rPr>
+          <w:rFonts w:ascii="Arial" w:hAnsi="Arial" w:eastAsia="Arial" w:cs="Arial"/>
+          <w:b w:val="0"/>
+          <w:i w:val="0"/>
+          <w:color w:val="000000"/>
+          <w:sz w:val="18"/>
+          <w:highlight w:val="lightGray"/>
+        </w:rPr>
+        <w:t>]</w:t>
       </w:r>
     </w:p>
     <w:p>

</xml_diff>